<commit_message>
Actualizacion a Acta de constitucion
Se adicionan restricciones el MVP
</commit_message>
<xml_diff>
--- a/Documentacion/01 Acta de Constitucion.docx
+++ b/Documentacion/01 Acta de Constitucion.docx
@@ -843,7 +843,7 @@
                 <w:szCs w:val="28"/>
                 <w:lang w:val="es-419"/>
               </w:rPr>
-              <w:t>05</w:t>
+              <w:t>25</w:t>
             </w:r>
             <w:r>
               <w:rPr>
@@ -1032,7 +1032,7 @@
             </w:rPr>
             <w:fldChar w:fldCharType="separate"/>
           </w:r>
-          <w:hyperlink w:anchor="_Toc239489845" w:history="1">
+          <w:hyperlink w:anchor="_Toc241250906" w:history="1">
             <w:r>
               <w:rPr>
                 <w:rStyle w:val="Hipervnculo"/>
@@ -1064,7 +1064,7 @@
                 <w:noProof/>
                 <w:webHidden/>
               </w:rPr>
-              <w:instrText xml:space="preserve"> PAGEREF _Toc239489845 \h </w:instrText>
+              <w:instrText xml:space="preserve"> PAGEREF _Toc241250906 \h </w:instrText>
             </w:r>
             <w:r>
               <w:rPr>
@@ -1114,7 +1114,7 @@
               <w14:ligatures w14:val="standardContextual"/>
             </w:rPr>
           </w:pPr>
-          <w:hyperlink w:anchor="_Toc239489846" w:history="1">
+          <w:hyperlink w:anchor="_Toc241250907" w:history="1">
             <w:r>
               <w:rPr>
                 <w:rStyle w:val="Hipervnculo"/>
@@ -1146,7 +1146,7 @@
                 <w:noProof/>
                 <w:webHidden/>
               </w:rPr>
-              <w:instrText xml:space="preserve"> PAGEREF _Toc239489846 \h </w:instrText>
+              <w:instrText xml:space="preserve"> PAGEREF _Toc241250907 \h </w:instrText>
             </w:r>
             <w:r>
               <w:rPr>
@@ -1197,7 +1197,7 @@
               <w14:ligatures w14:val="standardContextual"/>
             </w:rPr>
           </w:pPr>
-          <w:hyperlink w:anchor="_Toc239489847" w:history="1">
+          <w:hyperlink w:anchor="_Toc241250908" w:history="1">
             <w:r>
               <w:rPr>
                 <w:rStyle w:val="Hipervnculo"/>
@@ -1248,7 +1248,7 @@
                 <w:noProof/>
                 <w:webHidden/>
               </w:rPr>
-              <w:instrText xml:space="preserve"> PAGEREF _Toc239489847 \h </w:instrText>
+              <w:instrText xml:space="preserve"> PAGEREF _Toc241250908 \h </w:instrText>
             </w:r>
             <w:r>
               <w:rPr>
@@ -1299,7 +1299,7 @@
               <w14:ligatures w14:val="standardContextual"/>
             </w:rPr>
           </w:pPr>
-          <w:hyperlink w:anchor="_Toc239489848" w:history="1">
+          <w:hyperlink w:anchor="_Toc241250909" w:history="1">
             <w:r>
               <w:rPr>
                 <w:rStyle w:val="Hipervnculo"/>
@@ -1350,7 +1350,7 @@
                 <w:noProof/>
                 <w:webHidden/>
               </w:rPr>
-              <w:instrText xml:space="preserve"> PAGEREF _Toc239489848 \h </w:instrText>
+              <w:instrText xml:space="preserve"> PAGEREF _Toc241250909 \h </w:instrText>
             </w:r>
             <w:r>
               <w:rPr>
@@ -1401,7 +1401,7 @@
               <w14:ligatures w14:val="standardContextual"/>
             </w:rPr>
           </w:pPr>
-          <w:hyperlink w:anchor="_Toc239489849" w:history="1">
+          <w:hyperlink w:anchor="_Toc241250910" w:history="1">
             <w:r>
               <w:rPr>
                 <w:rStyle w:val="Hipervnculo"/>
@@ -1452,7 +1452,7 @@
                 <w:noProof/>
                 <w:webHidden/>
               </w:rPr>
-              <w:instrText xml:space="preserve"> PAGEREF _Toc239489849 \h </w:instrText>
+              <w:instrText xml:space="preserve"> PAGEREF _Toc241250910 \h </w:instrText>
             </w:r>
             <w:r>
               <w:rPr>
@@ -1503,7 +1503,7 @@
               <w14:ligatures w14:val="standardContextual"/>
             </w:rPr>
           </w:pPr>
-          <w:hyperlink w:anchor="_Toc239489850" w:history="1">
+          <w:hyperlink w:anchor="_Toc241250911" w:history="1">
             <w:r>
               <w:rPr>
                 <w:rStyle w:val="Hipervnculo"/>
@@ -1554,7 +1554,7 @@
                 <w:noProof/>
                 <w:webHidden/>
               </w:rPr>
-              <w:instrText xml:space="preserve"> PAGEREF _Toc239489850 \h </w:instrText>
+              <w:instrText xml:space="preserve"> PAGEREF _Toc241250911 \h </w:instrText>
             </w:r>
             <w:r>
               <w:rPr>
@@ -1605,7 +1605,7 @@
               <w14:ligatures w14:val="standardContextual"/>
             </w:rPr>
           </w:pPr>
-          <w:hyperlink w:anchor="_Toc239489851" w:history="1">
+          <w:hyperlink w:anchor="_Toc241250912" w:history="1">
             <w:r>
               <w:rPr>
                 <w:rStyle w:val="Hipervnculo"/>
@@ -1632,7 +1632,7 @@
                 <w:noProof/>
                 <w:lang w:val="es-419"/>
               </w:rPr>
-              <w:t>Incluido</w:t>
+              <w:t>Incluido en el MVP</w:t>
             </w:r>
             <w:r>
               <w:rPr>
@@ -1656,7 +1656,7 @@
                 <w:noProof/>
                 <w:webHidden/>
               </w:rPr>
-              <w:instrText xml:space="preserve"> PAGEREF _Toc239489851 \h </w:instrText>
+              <w:instrText xml:space="preserve"> PAGEREF _Toc241250912 \h </w:instrText>
             </w:r>
             <w:r>
               <w:rPr>
@@ -1707,7 +1707,7 @@
               <w14:ligatures w14:val="standardContextual"/>
             </w:rPr>
           </w:pPr>
-          <w:hyperlink w:anchor="_Toc239489852" w:history="1">
+          <w:hyperlink w:anchor="_Toc241250913" w:history="1">
             <w:r>
               <w:rPr>
                 <w:rStyle w:val="Hipervnculo"/>
@@ -1734,7 +1734,7 @@
                 <w:noProof/>
                 <w:lang w:val="es-419"/>
               </w:rPr>
-              <w:t>Excluido</w:t>
+              <w:t>Excluido del MVP</w:t>
             </w:r>
             <w:r>
               <w:rPr>
@@ -1758,7 +1758,7 @@
                 <w:noProof/>
                 <w:webHidden/>
               </w:rPr>
-              <w:instrText xml:space="preserve"> PAGEREF _Toc239489852 \h </w:instrText>
+              <w:instrText xml:space="preserve"> PAGEREF _Toc241250913 \h </w:instrText>
             </w:r>
             <w:r>
               <w:rPr>
@@ -1809,7 +1809,7 @@
               <w14:ligatures w14:val="standardContextual"/>
             </w:rPr>
           </w:pPr>
-          <w:hyperlink w:anchor="_Toc239489853" w:history="1">
+          <w:hyperlink w:anchor="_Toc241250914" w:history="1">
             <w:r>
               <w:rPr>
                 <w:rStyle w:val="Hipervnculo"/>
@@ -1860,7 +1860,7 @@
                 <w:noProof/>
                 <w:webHidden/>
               </w:rPr>
-              <w:instrText xml:space="preserve"> PAGEREF _Toc239489853 \h </w:instrText>
+              <w:instrText xml:space="preserve"> PAGEREF _Toc241250914 \h </w:instrText>
             </w:r>
             <w:r>
               <w:rPr>
@@ -1911,7 +1911,7 @@
               <w14:ligatures w14:val="standardContextual"/>
             </w:rPr>
           </w:pPr>
-          <w:hyperlink w:anchor="_Toc239489854" w:history="1">
+          <w:hyperlink w:anchor="_Toc241250915" w:history="1">
             <w:r>
               <w:rPr>
                 <w:rStyle w:val="Hipervnculo"/>
@@ -1962,7 +1962,7 @@
                 <w:noProof/>
                 <w:webHidden/>
               </w:rPr>
-              <w:instrText xml:space="preserve"> PAGEREF _Toc239489854 \h </w:instrText>
+              <w:instrText xml:space="preserve"> PAGEREF _Toc241250915 \h </w:instrText>
             </w:r>
             <w:r>
               <w:rPr>
@@ -2013,7 +2013,7 @@
               <w14:ligatures w14:val="standardContextual"/>
             </w:rPr>
           </w:pPr>
-          <w:hyperlink w:anchor="_Toc239489855" w:history="1">
+          <w:hyperlink w:anchor="_Toc241250916" w:history="1">
             <w:r>
               <w:rPr>
                 <w:rStyle w:val="Hipervnculo"/>
@@ -2064,7 +2064,7 @@
                 <w:noProof/>
                 <w:webHidden/>
               </w:rPr>
-              <w:instrText xml:space="preserve"> PAGEREF _Toc239489855 \h </w:instrText>
+              <w:instrText xml:space="preserve"> PAGEREF _Toc241250916 \h </w:instrText>
             </w:r>
             <w:r>
               <w:rPr>
@@ -2115,7 +2115,7 @@
               <w14:ligatures w14:val="standardContextual"/>
             </w:rPr>
           </w:pPr>
-          <w:hyperlink w:anchor="_Toc239489856" w:history="1">
+          <w:hyperlink w:anchor="_Toc241250917" w:history="1">
             <w:r>
               <w:rPr>
                 <w:rStyle w:val="Hipervnculo"/>
@@ -2166,7 +2166,7 @@
                 <w:noProof/>
                 <w:webHidden/>
               </w:rPr>
-              <w:instrText xml:space="preserve"> PAGEREF _Toc239489856 \h </w:instrText>
+              <w:instrText xml:space="preserve"> PAGEREF _Toc241250917 \h </w:instrText>
             </w:r>
             <w:r>
               <w:rPr>
@@ -2217,7 +2217,7 @@
               <w14:ligatures w14:val="standardContextual"/>
             </w:rPr>
           </w:pPr>
-          <w:hyperlink w:anchor="_Toc239489857" w:history="1">
+          <w:hyperlink w:anchor="_Toc241250918" w:history="1">
             <w:r>
               <w:rPr>
                 <w:rStyle w:val="Hipervnculo"/>
@@ -2268,7 +2268,7 @@
                 <w:noProof/>
                 <w:webHidden/>
               </w:rPr>
-              <w:instrText xml:space="preserve"> PAGEREF _Toc239489857 \h </w:instrText>
+              <w:instrText xml:space="preserve"> PAGEREF _Toc241250918 \h </w:instrText>
             </w:r>
             <w:r>
               <w:rPr>
@@ -2291,7 +2291,7 @@
                 <w:noProof/>
                 <w:webHidden/>
               </w:rPr>
-              <w:t>11</w:t>
+              <w:t>12</w:t>
             </w:r>
             <w:r>
               <w:rPr>
@@ -2319,7 +2319,7 @@
               <w14:ligatures w14:val="standardContextual"/>
             </w:rPr>
           </w:pPr>
-          <w:hyperlink w:anchor="_Toc239489858" w:history="1">
+          <w:hyperlink w:anchor="_Toc241250919" w:history="1">
             <w:r>
               <w:rPr>
                 <w:rStyle w:val="Hipervnculo"/>
@@ -2370,7 +2370,7 @@
                 <w:noProof/>
                 <w:webHidden/>
               </w:rPr>
-              <w:instrText xml:space="preserve"> PAGEREF _Toc239489858 \h </w:instrText>
+              <w:instrText xml:space="preserve"> PAGEREF _Toc241250919 \h </w:instrText>
             </w:r>
             <w:r>
               <w:rPr>
@@ -2421,7 +2421,7 @@
               <w14:ligatures w14:val="standardContextual"/>
             </w:rPr>
           </w:pPr>
-          <w:hyperlink w:anchor="_Toc239489859" w:history="1">
+          <w:hyperlink w:anchor="_Toc241250920" w:history="1">
             <w:r>
               <w:rPr>
                 <w:rStyle w:val="Hipervnculo"/>
@@ -2472,7 +2472,7 @@
                 <w:noProof/>
                 <w:webHidden/>
               </w:rPr>
-              <w:instrText xml:space="preserve"> PAGEREF _Toc239489859 \h </w:instrText>
+              <w:instrText xml:space="preserve"> PAGEREF _Toc241250920 \h </w:instrText>
             </w:r>
             <w:r>
               <w:rPr>
@@ -2523,7 +2523,7 @@
               <w14:ligatures w14:val="standardContextual"/>
             </w:rPr>
           </w:pPr>
-          <w:hyperlink w:anchor="_Toc239489860" w:history="1">
+          <w:hyperlink w:anchor="_Toc241250921" w:history="1">
             <w:r>
               <w:rPr>
                 <w:rStyle w:val="Hipervnculo"/>
@@ -2574,7 +2574,7 @@
                 <w:noProof/>
                 <w:webHidden/>
               </w:rPr>
-              <w:instrText xml:space="preserve"> PAGEREF _Toc239489860 \h </w:instrText>
+              <w:instrText xml:space="preserve"> PAGEREF _Toc241250921 \h </w:instrText>
             </w:r>
             <w:r>
               <w:rPr>
@@ -2625,7 +2625,7 @@
               <w14:ligatures w14:val="standardContextual"/>
             </w:rPr>
           </w:pPr>
-          <w:hyperlink w:anchor="_Toc239489861" w:history="1">
+          <w:hyperlink w:anchor="_Toc241250922" w:history="1">
             <w:r>
               <w:rPr>
                 <w:rStyle w:val="Hipervnculo"/>
@@ -2676,7 +2676,7 @@
                 <w:noProof/>
                 <w:webHidden/>
               </w:rPr>
-              <w:instrText xml:space="preserve"> PAGEREF _Toc239489861 \h </w:instrText>
+              <w:instrText xml:space="preserve"> PAGEREF _Toc241250922 \h </w:instrText>
             </w:r>
             <w:r>
               <w:rPr>
@@ -2727,7 +2727,7 @@
               <w14:ligatures w14:val="standardContextual"/>
             </w:rPr>
           </w:pPr>
-          <w:hyperlink w:anchor="_Toc239489862" w:history="1">
+          <w:hyperlink w:anchor="_Toc241250923" w:history="1">
             <w:r>
               <w:rPr>
                 <w:rStyle w:val="Hipervnculo"/>
@@ -2778,7 +2778,7 @@
                 <w:noProof/>
                 <w:webHidden/>
               </w:rPr>
-              <w:instrText xml:space="preserve"> PAGEREF _Toc239489862 \h </w:instrText>
+              <w:instrText xml:space="preserve"> PAGEREF _Toc241250923 \h </w:instrText>
             </w:r>
             <w:r>
               <w:rPr>
@@ -2829,7 +2829,7 @@
               <w14:ligatures w14:val="standardContextual"/>
             </w:rPr>
           </w:pPr>
-          <w:hyperlink w:anchor="_Toc239489863" w:history="1">
+          <w:hyperlink w:anchor="_Toc241250924" w:history="1">
             <w:r>
               <w:rPr>
                 <w:rStyle w:val="Hipervnculo"/>
@@ -2880,7 +2880,7 @@
                 <w:noProof/>
                 <w:webHidden/>
               </w:rPr>
-              <w:instrText xml:space="preserve"> PAGEREF _Toc239489863 \h </w:instrText>
+              <w:instrText xml:space="preserve"> PAGEREF _Toc241250924 \h </w:instrText>
             </w:r>
             <w:r>
               <w:rPr>
@@ -2903,7 +2903,7 @@
                 <w:noProof/>
                 <w:webHidden/>
               </w:rPr>
-              <w:t>13</w:t>
+              <w:t>14</w:t>
             </w:r>
             <w:r>
               <w:rPr>
@@ -2931,7 +2931,7 @@
               <w14:ligatures w14:val="standardContextual"/>
             </w:rPr>
           </w:pPr>
-          <w:hyperlink w:anchor="_Toc239489864" w:history="1">
+          <w:hyperlink w:anchor="_Toc241250925" w:history="1">
             <w:r>
               <w:rPr>
                 <w:rStyle w:val="Hipervnculo"/>
@@ -2982,7 +2982,7 @@
                 <w:noProof/>
                 <w:webHidden/>
               </w:rPr>
-              <w:instrText xml:space="preserve"> PAGEREF _Toc239489864 \h </w:instrText>
+              <w:instrText xml:space="preserve"> PAGEREF _Toc241250925 \h </w:instrText>
             </w:r>
             <w:r>
               <w:rPr>
@@ -3005,7 +3005,7 @@
                 <w:noProof/>
                 <w:webHidden/>
               </w:rPr>
-              <w:t>13</w:t>
+              <w:t>14</w:t>
             </w:r>
             <w:r>
               <w:rPr>
@@ -3033,7 +3033,7 @@
               <w14:ligatures w14:val="standardContextual"/>
             </w:rPr>
           </w:pPr>
-          <w:hyperlink w:anchor="_Toc239489865" w:history="1">
+          <w:hyperlink w:anchor="_Toc241250926" w:history="1">
             <w:r>
               <w:rPr>
                 <w:rStyle w:val="Hipervnculo"/>
@@ -3084,7 +3084,7 @@
                 <w:noProof/>
                 <w:webHidden/>
               </w:rPr>
-              <w:instrText xml:space="preserve"> PAGEREF _Toc239489865 \h </w:instrText>
+              <w:instrText xml:space="preserve"> PAGEREF _Toc241250926 \h </w:instrText>
             </w:r>
             <w:r>
               <w:rPr>
@@ -3135,7 +3135,7 @@
               <w14:ligatures w14:val="standardContextual"/>
             </w:rPr>
           </w:pPr>
-          <w:hyperlink w:anchor="_Toc239489866" w:history="1">
+          <w:hyperlink w:anchor="_Toc241250927" w:history="1">
             <w:r>
               <w:rPr>
                 <w:rStyle w:val="Hipervnculo"/>
@@ -3186,7 +3186,7 @@
                 <w:noProof/>
                 <w:webHidden/>
               </w:rPr>
-              <w:instrText xml:space="preserve"> PAGEREF _Toc239489866 \h </w:instrText>
+              <w:instrText xml:space="preserve"> PAGEREF _Toc241250927 \h </w:instrText>
             </w:r>
             <w:r>
               <w:rPr>
@@ -3313,7 +3313,7 @@
           <w14:ligatures w14:val="standardContextual"/>
         </w:rPr>
       </w:pPr>
-      <w:hyperlink w:anchor="_Toc239489867" w:history="1">
+      <w:hyperlink w:anchor="_Toc241250928" w:history="1">
         <w:r>
           <w:rPr>
             <w:rStyle w:val="Hipervnculo"/>
@@ -3342,7 +3342,7 @@
             <w:noProof/>
             <w:webHidden/>
           </w:rPr>
-          <w:instrText xml:space="preserve"> PAGEREF _Toc239489867 \h </w:instrText>
+          <w:instrText xml:space="preserve"> PAGEREF _Toc241250928 \h </w:instrText>
         </w:r>
         <w:r>
           <w:rPr>
@@ -3389,7 +3389,7 @@
           <w14:ligatures w14:val="standardContextual"/>
         </w:rPr>
       </w:pPr>
-      <w:hyperlink w:anchor="_Toc239489868" w:history="1">
+      <w:hyperlink w:anchor="_Toc241250929" w:history="1">
         <w:r>
           <w:rPr>
             <w:rStyle w:val="Hipervnculo"/>
@@ -3418,7 +3418,7 @@
             <w:noProof/>
             <w:webHidden/>
           </w:rPr>
-          <w:instrText xml:space="preserve"> PAGEREF _Toc239489868 \h </w:instrText>
+          <w:instrText xml:space="preserve"> PAGEREF _Toc241250929 \h </w:instrText>
         </w:r>
         <w:r>
           <w:rPr>
@@ -3465,7 +3465,7 @@
           <w14:ligatures w14:val="standardContextual"/>
         </w:rPr>
       </w:pPr>
-      <w:hyperlink w:anchor="_Toc239489869" w:history="1">
+      <w:hyperlink w:anchor="_Toc241250930" w:history="1">
         <w:r>
           <w:rPr>
             <w:rStyle w:val="Hipervnculo"/>
@@ -3494,7 +3494,7 @@
             <w:noProof/>
             <w:webHidden/>
           </w:rPr>
-          <w:instrText xml:space="preserve"> PAGEREF _Toc239489869 \h </w:instrText>
+          <w:instrText xml:space="preserve"> PAGEREF _Toc241250930 \h </w:instrText>
         </w:r>
         <w:r>
           <w:rPr>
@@ -3541,7 +3541,7 @@
           <w14:ligatures w14:val="standardContextual"/>
         </w:rPr>
       </w:pPr>
-      <w:hyperlink w:anchor="_Toc239489870" w:history="1">
+      <w:hyperlink w:anchor="_Toc241250931" w:history="1">
         <w:r>
           <w:rPr>
             <w:rStyle w:val="Hipervnculo"/>
@@ -3570,7 +3570,7 @@
             <w:noProof/>
             <w:webHidden/>
           </w:rPr>
-          <w:instrText xml:space="preserve"> PAGEREF _Toc239489870 \h </w:instrText>
+          <w:instrText xml:space="preserve"> PAGEREF _Toc241250931 \h </w:instrText>
         </w:r>
         <w:r>
           <w:rPr>
@@ -3590,7 +3590,7 @@
             <w:noProof/>
             <w:webHidden/>
           </w:rPr>
-          <w:t>9</w:t>
+          <w:t>10</w:t>
         </w:r>
         <w:r>
           <w:rPr>
@@ -3617,7 +3617,7 @@
           <w14:ligatures w14:val="standardContextual"/>
         </w:rPr>
       </w:pPr>
-      <w:hyperlink w:anchor="_Toc239489871" w:history="1">
+      <w:hyperlink w:anchor="_Toc241250932" w:history="1">
         <w:r>
           <w:rPr>
             <w:rStyle w:val="Hipervnculo"/>
@@ -3646,7 +3646,7 @@
             <w:noProof/>
             <w:webHidden/>
           </w:rPr>
-          <w:instrText xml:space="preserve"> PAGEREF _Toc239489871 \h </w:instrText>
+          <w:instrText xml:space="preserve"> PAGEREF _Toc241250932 \h </w:instrText>
         </w:r>
         <w:r>
           <w:rPr>
@@ -3693,7 +3693,7 @@
           <w14:ligatures w14:val="standardContextual"/>
         </w:rPr>
       </w:pPr>
-      <w:hyperlink w:anchor="_Toc239489872" w:history="1">
+      <w:hyperlink w:anchor="_Toc241250933" w:history="1">
         <w:r>
           <w:rPr>
             <w:rStyle w:val="Hipervnculo"/>
@@ -3722,7 +3722,7 @@
             <w:noProof/>
             <w:webHidden/>
           </w:rPr>
-          <w:instrText xml:space="preserve"> PAGEREF _Toc239489872 \h </w:instrText>
+          <w:instrText xml:space="preserve"> PAGEREF _Toc241250933 \h </w:instrText>
         </w:r>
         <w:r>
           <w:rPr>
@@ -3742,7 +3742,7 @@
             <w:noProof/>
             <w:webHidden/>
           </w:rPr>
-          <w:t>11</w:t>
+          <w:t>12</w:t>
         </w:r>
         <w:r>
           <w:rPr>
@@ -3769,7 +3769,7 @@
           <w14:ligatures w14:val="standardContextual"/>
         </w:rPr>
       </w:pPr>
-      <w:hyperlink w:anchor="_Toc239489873" w:history="1">
+      <w:hyperlink w:anchor="_Toc241250934" w:history="1">
         <w:r>
           <w:rPr>
             <w:rStyle w:val="Hipervnculo"/>
@@ -3798,7 +3798,7 @@
             <w:noProof/>
             <w:webHidden/>
           </w:rPr>
-          <w:instrText xml:space="preserve"> PAGEREF _Toc239489873 \h </w:instrText>
+          <w:instrText xml:space="preserve"> PAGEREF _Toc241250934 \h </w:instrText>
         </w:r>
         <w:r>
           <w:rPr>
@@ -3818,7 +3818,7 @@
             <w:noProof/>
             <w:webHidden/>
           </w:rPr>
-          <w:t>11</w:t>
+          <w:t>12</w:t>
         </w:r>
         <w:r>
           <w:rPr>
@@ -3845,7 +3845,7 @@
           <w14:ligatures w14:val="standardContextual"/>
         </w:rPr>
       </w:pPr>
-      <w:hyperlink w:anchor="_Toc239489874" w:history="1">
+      <w:hyperlink w:anchor="_Toc241250935" w:history="1">
         <w:r>
           <w:rPr>
             <w:rStyle w:val="Hipervnculo"/>
@@ -3874,7 +3874,7 @@
             <w:noProof/>
             <w:webHidden/>
           </w:rPr>
-          <w:instrText xml:space="preserve"> PAGEREF _Toc239489874 \h </w:instrText>
+          <w:instrText xml:space="preserve"> PAGEREF _Toc241250935 \h </w:instrText>
         </w:r>
         <w:r>
           <w:rPr>
@@ -3921,7 +3921,7 @@
           <w14:ligatures w14:val="standardContextual"/>
         </w:rPr>
       </w:pPr>
-      <w:hyperlink w:anchor="_Toc239489875" w:history="1">
+      <w:hyperlink w:anchor="_Toc241250936" w:history="1">
         <w:r>
           <w:rPr>
             <w:rStyle w:val="Hipervnculo"/>
@@ -3950,7 +3950,7 @@
             <w:noProof/>
             <w:webHidden/>
           </w:rPr>
-          <w:instrText xml:space="preserve"> PAGEREF _Toc239489875 \h </w:instrText>
+          <w:instrText xml:space="preserve"> PAGEREF _Toc241250936 \h </w:instrText>
         </w:r>
         <w:r>
           <w:rPr>
@@ -4025,7 +4025,7 @@
           <w:lang w:val="es-419"/>
         </w:rPr>
       </w:pPr>
-      <w:bookmarkStart w:id="0" w:name="_Toc239489845"/>
+      <w:bookmarkStart w:id="0" w:name="_Toc241250906"/>
       <w:r>
         <w:rPr>
           <w:rFonts w:ascii="Verdana" w:hAnsi="Verdana"/>
@@ -4068,8 +4068,8 @@
       <w:tblGrid>
         <w:gridCol w:w="1153"/>
         <w:gridCol w:w="1535"/>
-        <w:gridCol w:w="4897"/>
-        <w:gridCol w:w="1991"/>
+        <w:gridCol w:w="4957"/>
+        <w:gridCol w:w="1931"/>
       </w:tblGrid>
       <w:tr>
         <w:tc>
@@ -4854,6 +4854,89 @@
           </w:p>
         </w:tc>
       </w:tr>
+      <w:tr>
+        <w:tc>
+          <w:tcPr>
+            <w:tcW w:w="0" w:type="auto"/>
+          </w:tcPr>
+          <w:p>
+            <w:pPr>
+              <w:spacing w:line="23" w:lineRule="atLeast"/>
+              <w:rPr>
+                <w:rFonts w:ascii="Verdana" w:hAnsi="Verdana"/>
+                <w:lang w:val="es-419"/>
+              </w:rPr>
+            </w:pPr>
+            <w:r>
+              <w:rPr>
+                <w:rFonts w:ascii="Verdana" w:hAnsi="Verdana"/>
+              </w:rPr>
+              <w:t>1.1.0</w:t>
+            </w:r>
+          </w:p>
+        </w:tc>
+        <w:tc>
+          <w:tcPr>
+            <w:tcW w:w="0" w:type="auto"/>
+          </w:tcPr>
+          <w:p>
+            <w:pPr>
+              <w:spacing w:line="23" w:lineRule="atLeast"/>
+              <w:rPr>
+                <w:rFonts w:ascii="Verdana" w:hAnsi="Verdana"/>
+                <w:lang w:val="es-419"/>
+              </w:rPr>
+            </w:pPr>
+            <w:r>
+              <w:rPr>
+                <w:rFonts w:ascii="Verdana" w:hAnsi="Verdana"/>
+              </w:rPr>
+              <w:t>25/09/2026</w:t>
+            </w:r>
+          </w:p>
+        </w:tc>
+        <w:tc>
+          <w:tcPr>
+            <w:tcW w:w="0" w:type="auto"/>
+          </w:tcPr>
+          <w:p>
+            <w:pPr>
+              <w:spacing w:line="23" w:lineRule="atLeast"/>
+              <w:rPr>
+                <w:rFonts w:ascii="Verdana" w:hAnsi="Verdana"/>
+                <w:lang w:val="es-419"/>
+              </w:rPr>
+            </w:pPr>
+            <w:r>
+              <w:rPr>
+                <w:rFonts w:ascii="Verdana" w:hAnsi="Verdana"/>
+                <w:lang w:val="es-EC"/>
+              </w:rPr>
+              <w:t>Actualización del propósito, objetivos, alcance, exclusiones, restricciones y criterios de aprobación para delimitar expresamente la entrega al MVP y referenciar su documento de alcance.</w:t>
+            </w:r>
+          </w:p>
+        </w:tc>
+        <w:tc>
+          <w:tcPr>
+            <w:tcW w:w="0" w:type="auto"/>
+          </w:tcPr>
+          <w:p>
+            <w:pPr>
+              <w:spacing w:line="23" w:lineRule="atLeast"/>
+              <w:rPr>
+                <w:rFonts w:ascii="Verdana" w:hAnsi="Verdana"/>
+                <w:lang w:val="es-419"/>
+              </w:rPr>
+            </w:pPr>
+            <w:r>
+              <w:rPr>
+                <w:rFonts w:ascii="Verdana" w:hAnsi="Verdana"/>
+              </w:rPr>
+              <w:t>Alex Mendoza Morante</w:t>
+            </w:r>
+          </w:p>
+        </w:tc>
+      </w:tr>
     </w:tbl>
     <w:p>
       <w:pPr>
@@ -4870,7 +4953,7 @@
           <w:lang w:val="es-419"/>
         </w:rPr>
       </w:pPr>
-      <w:bookmarkStart w:id="1" w:name="_Toc239489867"/>
+      <w:bookmarkStart w:id="1" w:name="_Toc241250928"/>
       <w:r>
         <w:rPr>
           <w:rFonts w:ascii="Verdana" w:hAnsi="Verdana"/>
@@ -4986,7 +5069,7 @@
           <w:lang w:val="es-419"/>
         </w:rPr>
       </w:pPr>
-      <w:bookmarkStart w:id="2" w:name="_Toc239489846"/>
+      <w:bookmarkStart w:id="2" w:name="_Toc241250907"/>
       <w:r>
         <w:rPr>
           <w:rFonts w:ascii="Verdana" w:hAnsi="Verdana"/>
@@ -5796,7 +5879,7 @@
           <w:lang w:val="es-419"/>
         </w:rPr>
       </w:pPr>
-      <w:bookmarkStart w:id="3" w:name="_Toc239489868"/>
+      <w:bookmarkStart w:id="3" w:name="_Toc241250929"/>
       <w:r>
         <w:rPr>
           <w:rFonts w:ascii="Verdana" w:hAnsi="Verdana"/>
@@ -7042,7 +7125,29 @@
                 <w:szCs w:val="24"/>
                 <w:lang w:val="es-419"/>
               </w:rPr>
-              <w:t>1.0.0</w:t>
+              <w:t>1.</w:t>
+            </w:r>
+            <w:r>
+              <w:rPr>
+                <w:rFonts w:ascii="Verdana" w:hAnsi="Verdana"/>
+                <w:bCs/>
+                <w:iCs/>
+                <w:sz w:val="24"/>
+                <w:szCs w:val="24"/>
+                <w:lang w:val="es-419"/>
+              </w:rPr>
+              <w:t>1</w:t>
+            </w:r>
+            <w:r>
+              <w:rPr>
+                <w:rFonts w:ascii="Verdana" w:hAnsi="Verdana"/>
+                <w:bCs/>
+                <w:iCs/>
+                <w:sz w:val="24"/>
+                <w:szCs w:val="24"/>
+                <w:lang w:val="es-419"/>
+              </w:rPr>
+              <w:t>.0</w:t>
             </w:r>
           </w:p>
         </w:tc>
@@ -7106,7 +7211,18 @@
                 <w:szCs w:val="24"/>
                 <w:lang w:val="es-419"/>
               </w:rPr>
-              <w:t>21</w:t>
+              <w:t>2</w:t>
+            </w:r>
+            <w:r>
+              <w:rPr>
+                <w:rFonts w:ascii="Verdana" w:hAnsi="Verdana"/>
+                <w:bCs/>
+                <w:iCs/>
+                <w:sz w:val="24"/>
+                <w:szCs w:val="24"/>
+                <w:lang w:val="es-419"/>
+              </w:rPr>
+              <w:t>5</w:t>
             </w:r>
             <w:r>
               <w:rPr>
@@ -7171,7 +7287,7 @@
           <w:lang w:val="es-419"/>
         </w:rPr>
       </w:pPr>
-      <w:bookmarkStart w:id="4" w:name="_Toc239489847"/>
+      <w:bookmarkStart w:id="4" w:name="_Toc241250908"/>
       <w:r>
         <w:rPr>
           <w:rFonts w:ascii="Verdana" w:hAnsi="Verdana"/>
@@ -7234,9 +7350,9 @@
       <w:r>
         <w:rPr>
           <w:rFonts w:ascii="Verdana" w:hAnsi="Verdana"/>
-          <w:lang w:val="es-419"/>
-        </w:rPr>
-        <w:t>El proyecto propone desarrollar una plataforma web que permita organizar este proceso de forma accesible, segura y trazable, conectando a adultos mayores, familiares o cuidadores con voluntarios disponibles. La problemática y la visión completa de la solución se encuentran desarrolladas en el Documento de Visión.</w:t>
+          <w:lang w:val="es-EC"/>
+        </w:rPr>
+        <w:t>El proyecto propone desarrollar y validar un Producto Mínimo Viable (MVP) de una plataforma web accesible, segura y trazable. Esta versión permitirá presentar públicamente Barrio Solidario, registrar usuarios y proporcionar acceso seguro a un panel principal y a un perfil básico. La operación completa de solicitudes de asistencia, voluntariado, coordinación, seguimiento y administración avanzada se mantiene como alcance de una segunda versión, conforme al Documento del MVP.</w:t>
       </w:r>
     </w:p>
     <w:p>
@@ -7256,7 +7372,7 @@
           <w:lang w:val="es-419"/>
         </w:rPr>
       </w:pPr>
-      <w:bookmarkStart w:id="5" w:name="_Toc239489848"/>
+      <w:bookmarkStart w:id="5" w:name="_Toc241250909"/>
       <w:r>
         <w:rPr>
           <w:rFonts w:ascii="Verdana" w:hAnsi="Verdana"/>
@@ -7282,9 +7398,9 @@
       <w:r>
         <w:rPr>
           <w:rFonts w:ascii="Verdana" w:hAnsi="Verdana"/>
-          <w:lang w:val="es-419"/>
-        </w:rPr>
-        <w:t>Desarrollar y validar una plataforma web responsiva que permita gestionar solicitudes de ayuda para adultos mayores y coordinarlas con voluntarios, garantizando seguridad, accesibilidad, privacidad y trazabilidad durante el proceso de atención.</w:t>
+          <w:lang w:val="es-EC"/>
+        </w:rPr>
+        <w:t>Desarrollar, integrar y validar el Producto Mínimo Viable de Barrio Solidario, compuesto por un portal público, registro de usuarios, inicio y cierre de sesión, recuperación de contraseña, panel principal y perfil básico, aplicando controles esenciales de seguridad, accesibilidad, privacidad y trazabilidad.</w:t>
       </w:r>
     </w:p>
     <w:p>
@@ -7304,7 +7420,7 @@
           <w:lang w:val="es-419"/>
         </w:rPr>
       </w:pPr>
-      <w:bookmarkStart w:id="6" w:name="_Toc239489849"/>
+      <w:bookmarkStart w:id="6" w:name="_Toc241250910"/>
       <w:r>
         <w:rPr>
           <w:rFonts w:ascii="Verdana" w:hAnsi="Verdana"/>
@@ -7334,9 +7450,9 @@
       <w:r>
         <w:rPr>
           <w:rFonts w:ascii="Verdana" w:hAnsi="Verdana"/>
-          <w:lang w:val="es-419"/>
-        </w:rPr>
-        <w:t xml:space="preserve">Documentar los requisitos funcionales y de calidad de la solución. </w:t>
+          <w:lang w:val="es-EC"/>
+        </w:rPr>
+        <w:t>Documentar los requisitos funcionales y de calidad priorizados para el MVP.</w:t>
       </w:r>
     </w:p>
     <w:p>
@@ -7356,9 +7472,9 @@
       <w:r>
         <w:rPr>
           <w:rFonts w:ascii="Verdana" w:hAnsi="Verdana"/>
-          <w:lang w:val="es-419"/>
-        </w:rPr>
-        <w:t xml:space="preserve">Diseñar la arquitectura, el modelo de datos y las interfaces. </w:t>
+          <w:lang w:val="es-EC"/>
+        </w:rPr>
+        <w:t>Diseñar la arquitectura, el modelo de datos, los procesos y las interfaces necesarios para las funciones incluidas en el MVP.</w:t>
       </w:r>
     </w:p>
     <w:p>
@@ -7378,9 +7494,9 @@
       <w:r>
         <w:rPr>
           <w:rFonts w:ascii="Verdana" w:hAnsi="Verdana"/>
-          <w:lang w:val="es-419"/>
-        </w:rPr>
-        <w:t xml:space="preserve">Desarrollar los componentes principales de la plataforma. </w:t>
+          <w:lang w:val="es-EC"/>
+        </w:rPr>
+        <w:t>Desarrollar el portal público, el ciclo básico de acceso, el panel principal y la gestión del perfil básico.</w:t>
       </w:r>
     </w:p>
     <w:p>
@@ -7400,9 +7516,9 @@
       <w:r>
         <w:rPr>
           <w:rFonts w:ascii="Verdana" w:hAnsi="Verdana"/>
-          <w:lang w:val="es-419"/>
-        </w:rPr>
-        <w:t xml:space="preserve">Implementar controles de acceso, seguridad y protección de datos. </w:t>
+          <w:lang w:val="es-EC"/>
+        </w:rPr>
+        <w:t>Implementar controles de autenticación, sesiones, protección de rutas, validación de datos y almacenamiento seguro de contraseñas.</w:t>
       </w:r>
     </w:p>
     <w:p>
@@ -7422,9 +7538,9 @@
       <w:r>
         <w:rPr>
           <w:rFonts w:ascii="Verdana" w:hAnsi="Verdana"/>
-          <w:lang w:val="es-419"/>
-        </w:rPr>
-        <w:t xml:space="preserve">Integrar y probar los módulos desarrollados. </w:t>
+          <w:lang w:val="es-EC"/>
+        </w:rPr>
+        <w:t>Integrar y probar de principio a fin los componentes priorizados para el MVP.</w:t>
       </w:r>
     </w:p>
     <w:p>
@@ -7444,9 +7560,9 @@
       <w:r>
         <w:rPr>
           <w:rFonts w:ascii="Verdana" w:hAnsi="Verdana"/>
-          <w:lang w:val="es-419"/>
-        </w:rPr>
-        <w:t xml:space="preserve">Elaborar la documentación funcional y técnica del sistema. </w:t>
+          <w:lang w:val="es-EC"/>
+        </w:rPr>
+        <w:t>Mantener actualizada la documentación funcional y técnica, incluida la referencia al Documento del MVP.</w:t>
       </w:r>
     </w:p>
     <w:p>
@@ -7466,9 +7582,9 @@
       <w:r>
         <w:rPr>
           <w:rFonts w:ascii="Verdana" w:hAnsi="Verdana"/>
-          <w:lang w:val="es-419"/>
-        </w:rPr>
-        <w:t xml:space="preserve">Presentar una versión funcional que pueda ser evaluada académicamente. </w:t>
+          <w:lang w:val="es-EC"/>
+        </w:rPr>
+        <w:t>Presentar una versión funcional, instalable y demostrable que cumpla los criterios de aceptación definidos para el MVP.</w:t>
       </w:r>
     </w:p>
     <w:p>
@@ -7488,7 +7604,7 @@
           <w:lang w:val="es-419"/>
         </w:rPr>
       </w:pPr>
-      <w:bookmarkStart w:id="7" w:name="_Toc239489850"/>
+      <w:bookmarkStart w:id="7" w:name="_Toc241250911"/>
       <w:r>
         <w:rPr>
           <w:rFonts w:ascii="Verdana" w:hAnsi="Verdana"/>
@@ -7518,7 +7634,7 @@
           <w:lang w:val="es-419"/>
         </w:rPr>
       </w:pPr>
-      <w:bookmarkStart w:id="8" w:name="_Toc239489851"/>
+      <w:bookmarkStart w:id="8" w:name="_Toc241250912"/>
       <w:r>
         <w:rPr>
           <w:rFonts w:ascii="Verdana" w:hAnsi="Verdana"/>
@@ -7529,12 +7645,22 @@
         </w:rPr>
         <w:t>Incluido</w:t>
       </w:r>
+      <w:r>
+        <w:rPr>
+          <w:rFonts w:ascii="Verdana" w:hAnsi="Verdana"/>
+          <w:color w:val="943634" w:themeColor="accent2" w:themeShade="BF"/>
+          <w:sz w:val="28"/>
+          <w:szCs w:val="28"/>
+          <w:lang w:val="es-419"/>
+        </w:rPr>
+        <w:t xml:space="preserve"> en el MVP</w:t>
+      </w:r>
       <w:bookmarkEnd w:id="8"/>
     </w:p>
     <w:p>
       <w:pPr>
         <w:spacing w:line="23" w:lineRule="atLeast"/>
-        <w:ind w:firstLine="357"/>
+        <w:ind w:firstLine="717"/>
         <w:jc w:val="both"/>
         <w:rPr>
           <w:rFonts w:ascii="Verdana" w:hAnsi="Verdana"/>
@@ -7544,23 +7670,9 @@
       <w:r>
         <w:rPr>
           <w:rFonts w:ascii="Verdana" w:hAnsi="Verdana"/>
-          <w:lang w:val="es-419"/>
-        </w:rPr>
-        <w:t>El proyecto comprende el análisis, diseño, desarrollo, integración, prueba y documentación de una aplicación web responsiv</w:t>
-      </w:r>
-      <w:r>
-        <w:rPr>
-          <w:rFonts w:ascii="Verdana" w:hAnsi="Verdana"/>
-          <w:lang w:val="es-419"/>
-        </w:rPr>
-        <w:t>a</w:t>
-      </w:r>
-      <w:r>
-        <w:rPr>
-          <w:rFonts w:ascii="Verdana" w:hAnsi="Verdana"/>
-          <w:lang w:val="es-419"/>
-        </w:rPr>
-        <w:t>:</w:t>
+          <w:lang w:val="es-EC"/>
+        </w:rPr>
+        <w:t>Para esta versión, el proyecto comprende el análisis, diseño, desarrollo, integración, prueba y documentación de los siguientes componentes del Producto Mínimo Viable:</w:t>
       </w:r>
     </w:p>
     <w:p>
@@ -7582,7 +7694,8 @@
           <w:rFonts w:ascii="Verdana" w:hAnsi="Verdana"/>
           <w:lang w:val="es-EC"/>
         </w:rPr>
-        <w:t xml:space="preserve">Desarrollar una plataforma web comunitaria para conectar a adultos mayores que necesitan ayuda con familiares, cuidadores, voluntarios e instituciones aliadas. </w:t>
+        <w:lastRenderedPageBreak/>
+        <w:t>Proporcionar un portal público que pueda consultarse sin iniciar sesión.</w:t>
       </w:r>
     </w:p>
     <w:p>
@@ -7604,7 +7717,7 @@
           <w:rFonts w:ascii="Verdana" w:hAnsi="Verdana"/>
           <w:lang w:val="es-EC"/>
         </w:rPr>
-        <w:t xml:space="preserve">Proporcionar un portal público con información sobre el propósito, funcionamiento, beneficios, tipos de usuarios, métricas, aliados y canales de contacto. </w:t>
+        <w:t>Presentar páginas informativas de inicio, descripción del proyecto, funcionamiento, tipos de usuarios, beneficios, métricas demostrativas, aliados y contacto.</w:t>
       </w:r>
     </w:p>
     <w:p>
@@ -7626,7 +7739,7 @@
           <w:rFonts w:ascii="Verdana" w:hAnsi="Verdana"/>
           <w:lang w:val="es-EC"/>
         </w:rPr>
-        <w:t xml:space="preserve">Permitir el registro, inicio de sesión y recuperación de contraseña de los participantes. </w:t>
+        <w:t>Publicar términos y condiciones, política de privacidad, política de uso, política de voluntariado y lineamientos de protección de datos personales.</w:t>
       </w:r>
     </w:p>
     <w:p>
@@ -7648,8 +7761,7 @@
           <w:rFonts w:ascii="Verdana" w:hAnsi="Verdana"/>
           <w:lang w:val="es-EC"/>
         </w:rPr>
-        <w:lastRenderedPageBreak/>
-        <w:t xml:space="preserve">Administrar perfiles y accesos diferenciados según el rol asignado dentro de la plataforma. </w:t>
+        <w:t>Permitir el registro de una nueva cuenta y la selección del tipo de usuario.</w:t>
       </w:r>
     </w:p>
     <w:p>
@@ -7671,7 +7783,7 @@
           <w:rFonts w:ascii="Verdana" w:hAnsi="Verdana"/>
           <w:lang w:val="es-EC"/>
         </w:rPr>
-        <w:t xml:space="preserve">Registrar solicitudes de asistencia indicando el tipo de necesidad, prioridad, ubicación aproximada y disponibilidad. </w:t>
+        <w:t>Registrar nombres, correo electrónico y teléfono, con validación de campos obligatorios y formato.</w:t>
       </w:r>
     </w:p>
     <w:p>
@@ -7693,7 +7805,7 @@
           <w:rFonts w:ascii="Verdana" w:hAnsi="Verdana"/>
           <w:lang w:val="es-EC"/>
         </w:rPr>
-        <w:t xml:space="preserve">Permitir que los voluntarios consulten solicitudes cercanas y se postulen de acuerdo con su disponibilidad. </w:t>
+        <w:t>Crear y confirmar una contraseña y registrar la aceptación de términos y de la política de privacidad.</w:t>
       </w:r>
     </w:p>
     <w:p>
@@ -7715,7 +7827,7 @@
           <w:rFonts w:ascii="Verdana" w:hAnsi="Verdana"/>
           <w:lang w:val="es-EC"/>
         </w:rPr>
-        <w:t xml:space="preserve">Facilitar la revisión de solicitudes, validación de postulaciones y asignación de voluntarios. </w:t>
+        <w:t>Permitir el inicio y cierre de sesión mediante correo electrónico y contraseña.</w:t>
       </w:r>
     </w:p>
     <w:p>
@@ -7737,7 +7849,7 @@
           <w:rFonts w:ascii="Verdana" w:hAnsi="Verdana"/>
           <w:lang w:val="es-EC"/>
         </w:rPr>
-        <w:t xml:space="preserve">Apoyar la coordinación de la fecha, hora, lugar y condiciones de cada jornada de atención. </w:t>
+        <w:t>Validar las credenciales y controlar el estado básico de la cuenta.</w:t>
       </w:r>
     </w:p>
     <w:p>
@@ -7759,7 +7871,7 @@
           <w:rFonts w:ascii="Verdana" w:hAnsi="Verdana"/>
           <w:lang w:val="es-EC"/>
         </w:rPr>
-        <w:t xml:space="preserve">Registrar avances, mensajes, incidencias, reprogramaciones y evidencias relacionadas con la asistencia. </w:t>
+        <w:t>Permitir la recuperación de contraseña mediante un enlace o código temporal con vigencia limitada.</w:t>
       </w:r>
     </w:p>
     <w:p>
@@ -7781,7 +7893,7 @@
           <w:rFonts w:ascii="Verdana" w:hAnsi="Verdana"/>
           <w:lang w:val="es-EC"/>
         </w:rPr>
-        <w:t xml:space="preserve">Confirmar la recepción de la ayuda y permitir la evaluación de la atención brindada. </w:t>
+        <w:t>Permitir el registro de una nueva contraseña e invalidar el mecanismo de recuperación utilizado.</w:t>
       </w:r>
     </w:p>
     <w:p>
@@ -7803,7 +7915,7 @@
           <w:rFonts w:ascii="Verdana" w:hAnsi="Verdana"/>
           <w:lang w:val="es-EC"/>
         </w:rPr>
-        <w:t xml:space="preserve">Mantener la trazabilidad de las solicitudes desde su registro hasta su cierre. </w:t>
+        <w:t>Proteger las rutas privadas y mantener el control básico de las sesiones.</w:t>
       </w:r>
     </w:p>
     <w:p>
@@ -7825,7 +7937,7 @@
           <w:rFonts w:ascii="Verdana" w:hAnsi="Verdana"/>
           <w:lang w:val="es-EC"/>
         </w:rPr>
-        <w:t xml:space="preserve">Incorporar notificaciones para informar cambios de estado, asignaciones, mensajes y acciones pendientes. </w:t>
+        <w:t>Presentar un panel principal con mensaje de bienvenida, nombre, tipo de usuario, estado de cuenta y resumen de información personal.</w:t>
       </w:r>
     </w:p>
     <w:p>
@@ -7847,7 +7959,7 @@
           <w:rFonts w:ascii="Verdana" w:hAnsi="Verdana"/>
           <w:lang w:val="es-EC"/>
         </w:rPr>
-        <w:t xml:space="preserve">Proporcionar funciones administrativas para gestionar usuarios, roles, permisos, catálogos, instituciones e incidencias. </w:t>
+        <w:t>Permitir el acceso a Mi perfil, la consulta y edición de datos básicos, el cambio de contraseña y el cierre de sesión.</w:t>
       </w:r>
     </w:p>
     <w:p>
@@ -7869,7 +7981,7 @@
           <w:rFonts w:ascii="Verdana" w:hAnsi="Verdana"/>
           <w:lang w:val="es-EC"/>
         </w:rPr>
-        <w:t xml:space="preserve">Generar reportes e indicadores básicos para evaluar la atención y el impacto comunitario. </w:t>
+        <w:t>Adaptar el menú principal al tipo de usuario y mostrar avisos sobre módulos previstos para versiones posteriores.</w:t>
       </w:r>
     </w:p>
     <w:p>
@@ -7891,7 +8003,7 @@
           <w:rFonts w:ascii="Verdana" w:hAnsi="Verdana"/>
           <w:lang w:val="es-EC"/>
         </w:rPr>
-        <w:t xml:space="preserve">Aplicar controles de privacidad, seguridad, auditoría y protección de datos personales. </w:t>
+        <w:t>Contemplar los perfiles de adulto mayor, familiar o cuidador, voluntario, moderador y administrador con el alcance básico definido en el Documento del MVP.</w:t>
       </w:r>
     </w:p>
     <w:p>
@@ -7913,7 +8025,7 @@
           <w:rFonts w:ascii="Verdana" w:hAnsi="Verdana"/>
           <w:lang w:val="es-EC"/>
         </w:rPr>
-        <w:t>Diseñar una experiencia web adaptable, comprensible y accesible para diferentes dispositivos y capacidades de los usuarios.</w:t>
+        <w:t>Aplicar identidad visual, diseño adaptable, mensajes claros, contraste, navegación básica mediante teclado, hash de contraseñas, registro esencial de errores y separación entre interfaz, lógica y persistencia.</w:t>
       </w:r>
     </w:p>
     <w:p>
@@ -7934,7 +8046,7 @@
           <w:bCs/>
           <w:lang w:val="es-EC"/>
         </w:rPr>
-        <w:t>Acompañamiento al adulto mayor</w:t>
+        <w:t>Delimitación y referencia al Documento del MVP</w:t>
       </w:r>
     </w:p>
     <w:p>
@@ -7957,7 +8069,7 @@
           <w:rFonts w:ascii="Verdana" w:hAnsi="Verdana"/>
           <w:lang w:val="es-EC"/>
         </w:rPr>
-        <w:t xml:space="preserve">Permitir que el adulto mayor utilice directamente la plataforma cuando cuente con las capacidades y los recursos tecnológicos necesarios. </w:t>
+        <w:t>El alcance detallado, los tipos de usuario, los requisitos técnicos mínimos, los criterios de aceptación y las exclusiones se encuentran definidos en el documento “MVP de Barrio Solidario”.</w:t>
       </w:r>
     </w:p>
     <w:p>
@@ -7980,7 +8092,7 @@
           <w:rFonts w:ascii="Verdana" w:hAnsi="Verdana"/>
           <w:lang w:val="es-EC"/>
         </w:rPr>
-        <w:t xml:space="preserve">Reconocer que algunos adultos mayores pueden presentar discapacidades visuales, auditivas, cognitivas o motrices, además de restricciones de conectividad o alfabetización digital. </w:t>
+        <w:t>El Documento del MVP constituye la referencia funcional para determinar qué capacidades deben implementarse y demostrarse en esta entrega.</w:t>
       </w:r>
     </w:p>
     <w:p>
@@ -8003,7 +8115,7 @@
           <w:rFonts w:ascii="Verdana" w:hAnsi="Verdana"/>
           <w:lang w:val="es-EC"/>
         </w:rPr>
-        <w:t xml:space="preserve">Permitir que un familiar, cuidador o tutor autorizado cree y gestione solicitudes en representación del adulto mayor. </w:t>
+        <w:t>En caso de diferencia entre la visión general del producto y el alcance ejecutable, prevalecerá la delimitación aprobada en el Documento del MVP.</w:t>
       </w:r>
     </w:p>
     <w:p>
@@ -8026,7 +8138,7 @@
           <w:rFonts w:ascii="Verdana" w:hAnsi="Verdana"/>
           <w:lang w:val="es-EC"/>
         </w:rPr>
-        <w:t xml:space="preserve">Registrar la relación existente entre el beneficiario y la persona responsable de brindarle acompañamiento. </w:t>
+        <w:t>La gestión de solicitudes reales de asistencia se desarrollará en una segunda versión.</w:t>
       </w:r>
     </w:p>
     <w:p>
@@ -8049,7 +8161,7 @@
           <w:rFonts w:ascii="Verdana" w:hAnsi="Verdana"/>
           <w:lang w:val="es-EC"/>
         </w:rPr>
-        <w:t xml:space="preserve">Mantener claramente diferenciados los datos del adulto mayor beneficiario y los de su acompañante. </w:t>
+        <w:t>La vinculación operativa entre cuidadores y adultos mayores se desarrollará en una segunda versión.</w:t>
       </w:r>
     </w:p>
     <w:p>
@@ -8072,7 +8184,7 @@
           <w:rFonts w:ascii="Verdana" w:hAnsi="Verdana"/>
           <w:lang w:val="es-EC"/>
         </w:rPr>
-        <w:t xml:space="preserve">Permitir que el familiar o tutor consulte las solicitudes, reciba notificaciones y dé seguimiento a la atención. </w:t>
+        <w:t>La validación de voluntarios, la disponibilidad, la consulta de solicitudes y las postulaciones se desarrollarán en una segunda versión.</w:t>
       </w:r>
     </w:p>
     <w:p>
@@ -8095,7 +8207,8 @@
           <w:rFonts w:ascii="Verdana" w:hAnsi="Verdana"/>
           <w:lang w:val="es-EC"/>
         </w:rPr>
-        <w:t xml:space="preserve">Facilitar que el acompañante confirme la recepción de la ayuda y registre la evaluación del servicio cuando corresponda. </w:t>
+        <w:lastRenderedPageBreak/>
+        <w:t>La georreferenciación, los mapas, el cálculo de distancias y la búsqueda de solicitudes cercanas se desarrollarán en una segunda versión.</w:t>
       </w:r>
     </w:p>
     <w:p>
@@ -8118,7 +8231,7 @@
           <w:rFonts w:ascii="Verdana" w:hAnsi="Verdana"/>
           <w:lang w:val="es-EC"/>
         </w:rPr>
-        <w:t xml:space="preserve">Aplicar permisos para que el familiar o tutor acceda únicamente a la información de los adultos mayores bajo su responsabilidad. </w:t>
+        <w:t>La revisión de postulaciones, la asignación de voluntarios y la coordinación de jornadas se desarrollarán en una segunda versión.</w:t>
       </w:r>
     </w:p>
     <w:p>
@@ -8141,7 +8254,7 @@
           <w:rFonts w:ascii="Verdana" w:hAnsi="Verdana"/>
           <w:lang w:val="es-EC"/>
         </w:rPr>
-        <w:t xml:space="preserve">Registrar las acciones realizadas en representación del adulto mayor para conservar la trazabilidad. </w:t>
+        <w:t>El seguimiento de la atención, los avances, las evidencias, el cierre y la evaluación del servicio se desarrollarán en una segunda versión.</w:t>
       </w:r>
     </w:p>
     <w:p>
@@ -8164,8 +8277,7 @@
           <w:rFonts w:ascii="Verdana" w:hAnsi="Verdana"/>
           <w:lang w:val="es-EC"/>
         </w:rPr>
-        <w:lastRenderedPageBreak/>
-        <w:t xml:space="preserve">Proporcionar lenguaje sencillo, textos legibles, navegación guiada, instrucciones claras y controles fáciles de identificar. </w:t>
+        <w:t>La mensajería asociada con solicitudes y las notificaciones externas o avanzadas se desarrollarán en una segunda versión.</w:t>
       </w:r>
     </w:p>
     <w:p>
@@ -8188,7 +8300,7 @@
           <w:rFonts w:ascii="Verdana" w:hAnsi="Verdana"/>
           <w:lang w:val="es-EC"/>
         </w:rPr>
-        <w:t xml:space="preserve">Priorizar la autonomía del adulto mayor, permitiéndole participar en las decisiones siempre que sus condiciones lo permitan. </w:t>
+        <w:t>La moderación, la administración avanzada, los catálogos configurables y la gestión de instituciones se desarrollarán en una segunda versión.</w:t>
       </w:r>
     </w:p>
     <w:p>
@@ -8211,7 +8323,7 @@
           <w:rFonts w:ascii="Verdana" w:hAnsi="Verdana"/>
           <w:lang w:val="es-EC"/>
         </w:rPr>
-        <w:t xml:space="preserve">Proteger su privacidad, dignidad y consentimiento durante el registro, coordinación y prestación de la asistencia. </w:t>
+        <w:t>Los reportes, tableros, métricas de impacto y la auditoría completa se desarrollarán en una segunda versión.</w:t>
       </w:r>
     </w:p>
     <w:p>
@@ -8234,7 +8346,7 @@
           <w:rFonts w:ascii="Verdana" w:hAnsi="Verdana"/>
           <w:lang w:val="es-EC"/>
         </w:rPr>
-        <w:t xml:space="preserve">Contemplar mecanismos de apoyo alternativos cuando el adulto mayor no pueda completar una gestión digital sin acompañamiento. </w:t>
+        <w:t>Las integraciones con mapas, redes sociales, instituciones, mensajería, pagos, firma electrónica o proveedores de identidad quedan fuera del MVP.</w:t>
       </w:r>
     </w:p>
     <w:p>
@@ -8257,22 +8369,12 @@
           <w:rFonts w:ascii="Verdana" w:hAnsi="Verdana"/>
           <w:lang w:val="es-EC"/>
         </w:rPr>
-        <w:t>Incorporar progresivamente nuevas medidas de accesibilidad de acuerdo con las necesidades detectadas durante las pruebas con usuarios.</w:t>
+        <w:t>La aplicación se utilizará en un ambiente académico controlado, con información ficticia o anonimizada, y no se considerará lista para operación productiva.</w:t>
       </w:r>
     </w:p>
     <w:p>
       <w:pPr>
-        <w:spacing w:line="23" w:lineRule="atLeast"/>
-        <w:jc w:val="both"/>
-        <w:rPr>
-          <w:rFonts w:ascii="Verdana" w:hAnsi="Verdana"/>
-          <w:lang w:val="es-EC"/>
-        </w:rPr>
-      </w:pPr>
-    </w:p>
-    <w:p>
-      <w:pPr>
-        <w:spacing w:line="23" w:lineRule="atLeast"/>
+        <w:spacing w:before="120" w:after="120" w:line="23" w:lineRule="atLeast"/>
         <w:ind w:firstLine="357"/>
         <w:jc w:val="both"/>
         <w:rPr>
@@ -8283,9 +8385,9 @@
       <w:r>
         <w:rPr>
           <w:rFonts w:ascii="Verdana" w:hAnsi="Verdana"/>
-          <w:lang w:val="es-419"/>
-        </w:rPr>
-        <w:t>La definición detallada de las funcionalidades, reglas de negocio, requisitos y criterios técnicos se encuentra en el Documento de Visión y en la Especificación de Requisitos de Software.</w:t>
+          <w:lang w:val="es-EC"/>
+        </w:rPr>
+        <w:t>La definición detallada y vigente del alcance funcional, los tipos de usuario, los requisitos técnicos mínimos, los criterios de aceptación, las funcionalidades de la segunda versión y las exclusiones se encuentra en el Documento del MVP. El Documento de Visión y la Especificación de Requisitos describen la solución general y mantienen trazabilidad con esta delimitación.</w:t>
       </w:r>
     </w:p>
     <w:p>
@@ -8305,7 +8407,7 @@
           <w:lang w:val="es-419"/>
         </w:rPr>
       </w:pPr>
-      <w:bookmarkStart w:id="9" w:name="_Toc239489852"/>
+      <w:bookmarkStart w:id="9" w:name="_Toc241250913"/>
       <w:r>
         <w:rPr>
           <w:rFonts w:ascii="Verdana" w:hAnsi="Verdana"/>
@@ -8316,6 +8418,16 @@
         </w:rPr>
         <w:t>Excluido</w:t>
       </w:r>
+      <w:r>
+        <w:rPr>
+          <w:rFonts w:ascii="Verdana" w:hAnsi="Verdana"/>
+          <w:color w:val="943634" w:themeColor="accent2" w:themeShade="BF"/>
+          <w:sz w:val="28"/>
+          <w:szCs w:val="28"/>
+          <w:lang w:val="es-419"/>
+        </w:rPr>
+        <w:t xml:space="preserve"> del MVP</w:t>
+      </w:r>
       <w:bookmarkEnd w:id="9"/>
     </w:p>
     <w:p>
@@ -8330,9 +8442,45 @@
       <w:r>
         <w:rPr>
           <w:rFonts w:ascii="Verdana" w:hAnsi="Verdana"/>
-          <w:lang w:val="es-419"/>
-        </w:rPr>
-        <w:t>La primera versión no incluye:</w:t>
+          <w:lang w:val="es-EC"/>
+        </w:rPr>
+        <w:t xml:space="preserve">La versión entregable no incluye la operación completa de Barrio Solidario ni su uso con participantes reales. </w:t>
+      </w:r>
+      <w:proofErr w:type="gramStart"/>
+      <w:r>
+        <w:rPr>
+          <w:rFonts w:ascii="Verdana" w:hAnsi="Verdana"/>
+        </w:rPr>
+        <w:t xml:space="preserve">En particular, </w:t>
+      </w:r>
+      <w:proofErr w:type="spellStart"/>
+      <w:r>
+        <w:rPr>
+          <w:rFonts w:ascii="Verdana" w:hAnsi="Verdana"/>
+        </w:rPr>
+        <w:t>quedan</w:t>
+      </w:r>
+      <w:proofErr w:type="spellEnd"/>
+      <w:proofErr w:type="gramEnd"/>
+      <w:r>
+        <w:rPr>
+          <w:rFonts w:ascii="Verdana" w:hAnsi="Verdana"/>
+        </w:rPr>
+        <w:t xml:space="preserve"> </w:t>
+      </w:r>
+      <w:proofErr w:type="spellStart"/>
+      <w:r>
+        <w:rPr>
+          <w:rFonts w:ascii="Verdana" w:hAnsi="Verdana"/>
+        </w:rPr>
+        <w:t>excluidos</w:t>
+      </w:r>
+      <w:proofErr w:type="spellEnd"/>
+      <w:r>
+        <w:rPr>
+          <w:rFonts w:ascii="Verdana" w:hAnsi="Verdana"/>
+        </w:rPr>
+        <w:t>:</w:t>
       </w:r>
     </w:p>
     <w:p>
@@ -8352,9 +8500,9 @@
       <w:r>
         <w:rPr>
           <w:rFonts w:ascii="Verdana" w:hAnsi="Verdana"/>
-          <w:lang w:val="es-419"/>
-        </w:rPr>
-        <w:t xml:space="preserve">Aplicaciones móviles nativas. </w:t>
+          <w:lang w:val="es-EC"/>
+        </w:rPr>
+        <w:t>Creación, aprobación, seguimiento o cierre de solicitudes reales de asistencia.</w:t>
       </w:r>
     </w:p>
     <w:p>
@@ -8374,9 +8522,9 @@
       <w:r>
         <w:rPr>
           <w:rFonts w:ascii="Verdana" w:hAnsi="Verdana"/>
-          <w:lang w:val="es-419"/>
-        </w:rPr>
-        <w:t xml:space="preserve">Atención médica o servicios de emergencia. </w:t>
+          <w:lang w:val="es-EC"/>
+        </w:rPr>
+        <w:t>Vinculación operativa de cuidadores, adultos mayores y beneficiarios.</w:t>
       </w:r>
     </w:p>
     <w:p>
@@ -8396,9 +8544,9 @@
       <w:r>
         <w:rPr>
           <w:rFonts w:ascii="Verdana" w:hAnsi="Verdana"/>
-          <w:lang w:val="es-419"/>
-        </w:rPr>
-        <w:t xml:space="preserve">Manejo de pagos o donaciones. </w:t>
+          <w:lang w:val="es-EC"/>
+        </w:rPr>
+        <w:t>Validación de voluntarios, consulta de solicitudes, postulaciones y asignaciones.</w:t>
       </w:r>
     </w:p>
     <w:p>
@@ -8418,9 +8566,9 @@
       <w:r>
         <w:rPr>
           <w:rFonts w:ascii="Verdana" w:hAnsi="Verdana"/>
-          <w:lang w:val="es-419"/>
-        </w:rPr>
-        <w:t xml:space="preserve">Seguimiento permanente mediante GPS. </w:t>
+          <w:lang w:val="es-EC"/>
+        </w:rPr>
+        <w:t>Georreferenciación, mapas interactivos, cálculo de distancias o seguimiento de recorridos.</w:t>
       </w:r>
     </w:p>
     <w:p>
@@ -8440,9 +8588,9 @@
       <w:r>
         <w:rPr>
           <w:rFonts w:ascii="Verdana" w:hAnsi="Verdana"/>
-          <w:lang w:val="es-419"/>
-        </w:rPr>
-        <w:t xml:space="preserve">Inteligencia artificial para asignar voluntarios. </w:t>
+          <w:lang w:val="es-EC"/>
+        </w:rPr>
+        <w:t>Coordinación de jornadas, registro de avances, evidencias y evaluación de la atención.</w:t>
       </w:r>
     </w:p>
     <w:p>
@@ -8462,9 +8610,9 @@
       <w:r>
         <w:rPr>
           <w:rFonts w:ascii="Verdana" w:hAnsi="Verdana"/>
-          <w:lang w:val="es-419"/>
-        </w:rPr>
-        <w:t xml:space="preserve">Integraciones avanzadas con instituciones externas. </w:t>
+          <w:lang w:val="es-EC"/>
+        </w:rPr>
+        <w:t>Mensajería en tiempo real, notificaciones externas y comunicación avanzada.</w:t>
       </w:r>
     </w:p>
     <w:p>
@@ -8484,9 +8632,44 @@
       <w:r>
         <w:rPr>
           <w:rFonts w:ascii="Verdana" w:hAnsi="Verdana"/>
+          <w:lang w:val="es-EC"/>
+        </w:rPr>
+        <w:t>Administración avanzada, reportes operativos, métricas de impacto e integraciones con terceros.</w:t>
+      </w:r>
+    </w:p>
+    <w:p>
+      <w:pPr>
+        <w:spacing w:after="0" w:line="23" w:lineRule="atLeast"/>
+        <w:jc w:val="both"/>
+        <w:rPr>
+          <w:rFonts w:ascii="Verdana" w:hAnsi="Verdana"/>
           <w:lang w:val="es-419"/>
         </w:rPr>
-        <w:t xml:space="preserve">Operación multiinstitucional o alta disponibilidad empresarial. </w:t>
+      </w:pPr>
+      <w:r>
+        <w:rPr>
+          <w:rFonts w:ascii="Verdana" w:hAnsi="Verdana"/>
+          <w:lang w:val="es-419"/>
+        </w:rPr>
+        <w:t xml:space="preserve"> </w:t>
+      </w:r>
+    </w:p>
+    <w:p>
+      <w:pPr>
+        <w:shd w:val="clear" w:color="auto" w:fill="D9D9D9" w:themeFill="background1" w:themeFillShade="D9"/>
+        <w:spacing w:after="0" w:line="23" w:lineRule="atLeast"/>
+        <w:jc w:val="both"/>
+        <w:rPr>
+          <w:rFonts w:ascii="Verdana" w:hAnsi="Verdana"/>
+          <w:lang w:val="es-419"/>
+        </w:rPr>
+      </w:pPr>
+      <w:r>
+        <w:rPr>
+          <w:rFonts w:ascii="Verdana" w:hAnsi="Verdana"/>
+          <w:lang w:val="es-419"/>
+        </w:rPr>
+        <w:t>Nota. Se trata de un proyecto académico, por lo que queda excluida la puesta en producción, arquitectura, servidores.</w:t>
       </w:r>
     </w:p>
     <w:p>
@@ -8506,7 +8689,7 @@
           <w:lang w:val="es-419"/>
         </w:rPr>
       </w:pPr>
-      <w:bookmarkStart w:id="10" w:name="_Toc239489853"/>
+      <w:bookmarkStart w:id="10" w:name="_Toc241250914"/>
       <w:r>
         <w:rPr>
           <w:rFonts w:ascii="Verdana" w:hAnsi="Verdana"/>
@@ -8663,7 +8846,15 @@
                 <w:rFonts w:ascii="Verdana" w:hAnsi="Verdana"/>
                 <w:lang w:val="es-EC"/>
               </w:rPr>
-              <w:t>Documento PDF de entrega</w:t>
+              <w:t xml:space="preserve">Documento PDF de </w:t>
+            </w:r>
+            <w:r>
+              <w:rPr>
+                <w:rFonts w:ascii="Verdana" w:hAnsi="Verdana"/>
+                <w:lang w:val="es-EC"/>
+              </w:rPr>
+              <w:lastRenderedPageBreak/>
+              <w:t>entrega</w:t>
             </w:r>
           </w:p>
         </w:tc>
@@ -8685,7 +8876,16 @@
                 <w:rFonts w:ascii="Verdana" w:hAnsi="Verdana"/>
                 <w:lang w:val="es-EC"/>
               </w:rPr>
-              <w:t>Nombres de los integrantes, identificación del proyecto y relación de documentos entregados.</w:t>
+              <w:lastRenderedPageBreak/>
+              <w:t xml:space="preserve">Nombres de los integrantes, identificación del proyecto </w:t>
+            </w:r>
+            <w:r>
+              <w:rPr>
+                <w:rFonts w:ascii="Verdana" w:hAnsi="Verdana"/>
+                <w:lang w:val="es-EC"/>
+              </w:rPr>
+              <w:lastRenderedPageBreak/>
+              <w:t>y relación de documentos entregados.</w:t>
             </w:r>
           </w:p>
         </w:tc>
@@ -9071,15 +9271,7 @@
                 <w:rFonts w:ascii="Verdana" w:hAnsi="Verdana"/>
                 <w:lang w:val="es-EC"/>
               </w:rPr>
-              <w:t xml:space="preserve">Actividades y </w:t>
-            </w:r>
-            <w:r>
-              <w:rPr>
-                <w:rFonts w:ascii="Verdana" w:hAnsi="Verdana"/>
-                <w:lang w:val="es-EC"/>
-              </w:rPr>
-              <w:lastRenderedPageBreak/>
-              <w:t>unidades de trabajo</w:t>
+              <w:t>Actividades y unidades de trabajo</w:t>
             </w:r>
           </w:p>
         </w:tc>
@@ -9101,16 +9293,7 @@
                 <w:rFonts w:ascii="Verdana" w:hAnsi="Verdana"/>
                 <w:lang w:val="es-EC"/>
               </w:rPr>
-              <w:lastRenderedPageBreak/>
-              <w:t xml:space="preserve">Descomposición de las historias en actividades y </w:t>
-            </w:r>
-            <w:r>
-              <w:rPr>
-                <w:rFonts w:ascii="Verdana" w:hAnsi="Verdana"/>
-                <w:lang w:val="es-EC"/>
-              </w:rPr>
-              <w:lastRenderedPageBreak/>
-              <w:t>tareas asignadas a los participantes.</w:t>
+              <w:t>Descomposición de las historias en actividades y tareas asignadas a los participantes.</w:t>
             </w:r>
           </w:p>
         </w:tc>
@@ -9455,6 +9638,72 @@
           </w:p>
         </w:tc>
       </w:tr>
+      <w:tr>
+        <w:tc>
+          <w:tcPr>
+            <w:tcW w:w="614" w:type="dxa"/>
+          </w:tcPr>
+          <w:p>
+            <w:pPr>
+              <w:rPr>
+                <w:rFonts w:ascii="Verdana" w:hAnsi="Verdana"/>
+              </w:rPr>
+            </w:pPr>
+            <w:r>
+              <w:rPr>
+                <w:rFonts w:ascii="Verdana" w:hAnsi="Verdana"/>
+              </w:rPr>
+              <w:t>13</w:t>
+            </w:r>
+          </w:p>
+        </w:tc>
+        <w:tc>
+          <w:tcPr>
+            <w:tcW w:w="2603" w:type="dxa"/>
+          </w:tcPr>
+          <w:p>
+            <w:pPr>
+              <w:rPr>
+                <w:rFonts w:ascii="Verdana" w:hAnsi="Verdana"/>
+              </w:rPr>
+            </w:pPr>
+            <w:proofErr w:type="spellStart"/>
+            <w:r>
+              <w:rPr>
+                <w:rFonts w:ascii="Verdana" w:hAnsi="Verdana"/>
+              </w:rPr>
+              <w:t>Documento</w:t>
+            </w:r>
+            <w:proofErr w:type="spellEnd"/>
+            <w:r>
+              <w:rPr>
+                <w:rFonts w:ascii="Verdana" w:hAnsi="Verdana"/>
+              </w:rPr>
+              <w:t xml:space="preserve"> del MVP</w:t>
+            </w:r>
+          </w:p>
+        </w:tc>
+        <w:tc>
+          <w:tcPr>
+            <w:tcW w:w="6359" w:type="dxa"/>
+          </w:tcPr>
+          <w:p>
+            <w:pPr>
+              <w:rPr>
+                <w:rFonts w:ascii="Verdana" w:hAnsi="Verdana"/>
+                <w:lang w:val="es-EC"/>
+              </w:rPr>
+            </w:pPr>
+            <w:r>
+              <w:rPr>
+                <w:rFonts w:ascii="Verdana" w:hAnsi="Verdana"/>
+                <w:lang w:val="es-EC"/>
+              </w:rPr>
+              <w:t>Objetivo, funcionalidades incluidas, tipos de usuario, requisitos técnicos mínimos, criterios de aceptación, alcance de la segunda versión y exclusiones de la entrega actual.</w:t>
+            </w:r>
+          </w:p>
+        </w:tc>
+      </w:tr>
     </w:tbl>
     <w:p>
       <w:pPr>
@@ -9471,7 +9720,7 @@
           <w:lang w:val="es-419"/>
         </w:rPr>
       </w:pPr>
-      <w:bookmarkStart w:id="11" w:name="_Toc239489869"/>
+      <w:bookmarkStart w:id="11" w:name="_Toc241250930"/>
       <w:r>
         <w:rPr>
           <w:rFonts w:ascii="Verdana" w:hAnsi="Verdana"/>
@@ -9576,7 +9825,7 @@
           <w:lang w:val="es-419"/>
         </w:rPr>
       </w:pPr>
-      <w:bookmarkStart w:id="12" w:name="_Toc239489854"/>
+      <w:bookmarkStart w:id="12" w:name="_Toc241250915"/>
       <w:r>
         <w:rPr>
           <w:rFonts w:ascii="Verdana" w:hAnsi="Verdana"/>
@@ -9948,6 +10197,7 @@
                 <w:rFonts w:ascii="Verdana" w:hAnsi="Verdana"/>
                 <w:lang w:val="es-419"/>
               </w:rPr>
+              <w:lastRenderedPageBreak/>
               <w:t>Kevin Carriel Bonoso</w:t>
             </w:r>
           </w:p>
@@ -10237,7 +10487,7 @@
           <w:lang w:val="es-419"/>
         </w:rPr>
       </w:pPr>
-      <w:bookmarkStart w:id="13" w:name="_Toc239489870"/>
+      <w:bookmarkStart w:id="13" w:name="_Toc241250931"/>
       <w:r>
         <w:rPr>
           <w:rFonts w:ascii="Verdana" w:hAnsi="Verdana"/>
@@ -10360,7 +10610,7 @@
           <w:lang w:val="es-419"/>
         </w:rPr>
       </w:pPr>
-      <w:bookmarkStart w:id="14" w:name="_Toc239489855"/>
+      <w:bookmarkStart w:id="14" w:name="_Toc241250916"/>
       <w:r>
         <w:rPr>
           <w:rFonts w:ascii="Verdana" w:hAnsi="Verdana"/>
@@ -10369,7 +10619,6 @@
           <w:szCs w:val="32"/>
           <w:lang w:val="es-419"/>
         </w:rPr>
-        <w:lastRenderedPageBreak/>
         <w:t>Cronograma de hitos</w:t>
       </w:r>
       <w:bookmarkEnd w:id="14"/>
@@ -11057,6 +11306,7 @@
                 <w:rFonts w:ascii="Verdana" w:hAnsi="Verdana"/>
                 <w:lang w:val="es-419"/>
               </w:rPr>
+              <w:lastRenderedPageBreak/>
               <w:t>Sprint 2</w:t>
             </w:r>
           </w:p>
@@ -11503,7 +11753,6 @@
                 <w:rFonts w:ascii="Verdana" w:hAnsi="Verdana"/>
                 <w:lang w:val="es-419"/>
               </w:rPr>
-              <w:lastRenderedPageBreak/>
               <w:t>Sprint 3</w:t>
             </w:r>
           </w:p>
@@ -12187,7 +12436,7 @@
           <w:lang w:val="es-419"/>
         </w:rPr>
       </w:pPr>
-      <w:bookmarkStart w:id="15" w:name="_Toc239489871"/>
+      <w:bookmarkStart w:id="15" w:name="_Toc241250932"/>
       <w:r>
         <w:rPr>
           <w:rFonts w:ascii="Verdana" w:hAnsi="Verdana"/>
@@ -12292,7 +12541,7 @@
           <w:lang w:val="es-419"/>
         </w:rPr>
       </w:pPr>
-      <w:bookmarkStart w:id="16" w:name="_Toc239489856"/>
+      <w:bookmarkStart w:id="16" w:name="_Toc241250917"/>
       <w:r>
         <w:rPr>
           <w:rFonts w:ascii="Verdana" w:hAnsi="Verdana"/>
@@ -12550,6 +12799,7 @@
                 <w:rFonts w:ascii="Verdana" w:hAnsi="Verdana"/>
                 <w:lang w:val="es-419"/>
               </w:rPr>
+              <w:lastRenderedPageBreak/>
               <w:t xml:space="preserve">Tutoría y seguimiento del Sprint </w:t>
             </w:r>
             <w:r>
@@ -12647,7 +12897,7 @@
           <w:lang w:val="es-419"/>
         </w:rPr>
       </w:pPr>
-      <w:bookmarkStart w:id="17" w:name="_Toc239489872"/>
+      <w:bookmarkStart w:id="17" w:name="_Toc241250933"/>
       <w:r>
         <w:rPr>
           <w:rFonts w:ascii="Verdana" w:hAnsi="Verdana"/>
@@ -12752,7 +13002,7 @@
           <w:lang w:val="es-419"/>
         </w:rPr>
       </w:pPr>
-      <w:bookmarkStart w:id="18" w:name="_Toc239489857"/>
+      <w:bookmarkStart w:id="18" w:name="_Toc241250918"/>
       <w:r>
         <w:rPr>
           <w:rFonts w:ascii="Verdana" w:hAnsi="Verdana"/>
@@ -13095,7 +13345,7 @@
           <w:lang w:val="es-419"/>
         </w:rPr>
       </w:pPr>
-      <w:bookmarkStart w:id="19" w:name="_Toc239489873"/>
+      <w:bookmarkStart w:id="19" w:name="_Toc241250934"/>
       <w:r>
         <w:rPr>
           <w:rFonts w:ascii="Verdana" w:hAnsi="Verdana"/>
@@ -13197,15 +13447,7 @@
           <w:rFonts w:ascii="Verdana" w:hAnsi="Verdana"/>
           <w:lang w:val="es-419"/>
         </w:rPr>
-        <w:t xml:space="preserve">Las actividades específicas, responsables, dependencias y avances serán administrados en el Product Backlog y en las unidades de trabajo registradas en Jira. Cualquier desviación que pueda afectar los hitos deberá ser comunicada por el </w:t>
-      </w:r>
-      <w:r>
-        <w:rPr>
-          <w:rFonts w:ascii="Verdana" w:hAnsi="Verdana"/>
-          <w:lang w:val="es-419"/>
-        </w:rPr>
-        <w:lastRenderedPageBreak/>
-        <w:t>Scrum Master y evaluada por el equipo durante la planificación o revisión del Sprint.</w:t>
+        <w:t>Las actividades específicas, responsables, dependencias y avances serán administrados en el Product Backlog y en las unidades de trabajo registradas en Jira. Cualquier desviación que pueda afectar los hitos deberá ser comunicada por el Scrum Master y evaluada por el equipo durante la planificación o revisión del Sprint.</w:t>
       </w:r>
     </w:p>
     <w:p>
@@ -13225,7 +13467,7 @@
           <w:lang w:val="es-419"/>
         </w:rPr>
       </w:pPr>
-      <w:bookmarkStart w:id="20" w:name="_Toc239489858"/>
+      <w:bookmarkStart w:id="20" w:name="_Toc241250919"/>
       <w:r>
         <w:rPr>
           <w:rFonts w:ascii="Verdana" w:hAnsi="Verdana"/>
@@ -13253,7 +13495,7 @@
           <w:lang w:val="es-419"/>
         </w:rPr>
       </w:pPr>
-      <w:bookmarkStart w:id="21" w:name="_Toc239489859"/>
+      <w:bookmarkStart w:id="21" w:name="_Toc241250920"/>
       <w:r>
         <w:rPr>
           <w:rFonts w:ascii="Verdana" w:hAnsi="Verdana"/>
@@ -13400,7 +13642,7 @@
           <w:lang w:val="es-419"/>
         </w:rPr>
       </w:pPr>
-      <w:bookmarkStart w:id="22" w:name="_Toc239489860"/>
+      <w:bookmarkStart w:id="22" w:name="_Toc241250921"/>
       <w:r>
         <w:rPr>
           <w:rFonts w:ascii="Verdana" w:hAnsi="Verdana"/>
@@ -13427,10 +13669,10 @@
       </w:pPr>
       <w:r>
         <w:rPr>
-          <w:rFonts w:ascii="Verdana" w:eastAsia="Times New Roman" w:hAnsi="Verdana" w:cs="Times New Roman"/>
-          <w:lang w:val="es-EC" w:eastAsia="es-EC"/>
-        </w:rPr>
-        <w:t xml:space="preserve">El proyecto dispone de cuatro semanas para entregar una aplicación web funcional. </w:t>
+          <w:rFonts w:ascii="Verdana" w:hAnsi="Verdana"/>
+          <w:lang w:val="es-EC"/>
+        </w:rPr>
+        <w:t>El desarrollo funcional dispone de cuatro semanas dentro del cronograma general para completar, integrar, probar y presentar el MVP definido en su documento de alcance.</w:t>
       </w:r>
     </w:p>
     <w:p>
@@ -13449,10 +13691,10 @@
       </w:pPr>
       <w:r>
         <w:rPr>
-          <w:rFonts w:ascii="Verdana" w:eastAsia="Times New Roman" w:hAnsi="Verdana" w:cs="Times New Roman"/>
-          <w:lang w:val="es-EC" w:eastAsia="es-EC"/>
-        </w:rPr>
-        <w:t xml:space="preserve">El desarrollo se limitará al MVP para asegurar que las funciones esenciales puedan completarse, probarse y presentarse dentro del plazo. </w:t>
+          <w:rFonts w:ascii="Verdana" w:hAnsi="Verdana"/>
+          <w:lang w:val="es-EC"/>
+        </w:rPr>
+        <w:t>El desarrollo se limitará estrictamente al MVP para asegurar que las funciones esenciales puedan completarse, probarse y presentarse dentro del plazo.</w:t>
       </w:r>
     </w:p>
     <w:p>
@@ -13537,10 +13779,10 @@
       </w:pPr>
       <w:r>
         <w:rPr>
-          <w:rFonts w:ascii="Verdana" w:eastAsia="Times New Roman" w:hAnsi="Verdana" w:cs="Times New Roman"/>
-          <w:lang w:val="es-EC" w:eastAsia="es-EC"/>
-        </w:rPr>
-        <w:t xml:space="preserve">El MVP comprenderá el portal público, registro de usuarios, inicio de sesión, recuperación de contraseña y panel principal básico. </w:t>
+          <w:rFonts w:ascii="Verdana" w:hAnsi="Verdana"/>
+          <w:lang w:val="es-EC"/>
+        </w:rPr>
+        <w:t>El MVP comprenderá el portal público, registro de usuarios, inicio y cierre de sesión, recuperación de contraseña, panel principal y perfil básico.</w:t>
       </w:r>
     </w:p>
     <w:p>
@@ -13584,6 +13826,7 @@
           <w:rFonts w:ascii="Verdana" w:eastAsia="Times New Roman" w:hAnsi="Verdana" w:cs="Times New Roman"/>
           <w:lang w:val="es-EC" w:eastAsia="es-EC"/>
         </w:rPr>
+        <w:lastRenderedPageBreak/>
         <w:t xml:space="preserve">No se implementarán inicialmente mapas interactivos, geolocalización en tiempo real ni cálculo automático de distancias. </w:t>
       </w:r>
     </w:p>
@@ -13685,10 +13928,10 @@
       </w:pPr>
       <w:r>
         <w:rPr>
-          <w:rFonts w:ascii="Verdana" w:eastAsia="Times New Roman" w:hAnsi="Verdana" w:cs="Times New Roman"/>
-          <w:lang w:val="es-EC" w:eastAsia="es-EC"/>
-        </w:rPr>
-        <w:t xml:space="preserve">La aprobación de usuarios, solicitudes o postulaciones podrá manejarse de forma básica o mediante datos de prueba. </w:t>
+          <w:rFonts w:ascii="Verdana" w:hAnsi="Verdana"/>
+          <w:lang w:val="es-EC"/>
+        </w:rPr>
+        <w:t>No se implementarán solicitudes reales, postulaciones, asignaciones ni procesos completos de aprobación; estas capacidades corresponden a la segunda versión.</w:t>
       </w:r>
     </w:p>
     <w:p>
@@ -13794,11 +14037,10 @@
       </w:pPr>
       <w:r>
         <w:rPr>
-          <w:rFonts w:ascii="Verdana" w:eastAsia="Times New Roman" w:hAnsi="Verdana" w:cs="Times New Roman"/>
-          <w:lang w:val="es-EC" w:eastAsia="es-EC"/>
-        </w:rPr>
-        <w:lastRenderedPageBreak/>
-        <w:t>Las decisiones de alcance deberán ser aprobadas por el Product Owner para evitar incorporar funcionalidades que comprometan la entrega del MVP.</w:t>
+          <w:rFonts w:ascii="Verdana" w:hAnsi="Verdana"/>
+          <w:lang w:val="es-EC"/>
+        </w:rPr>
+        <w:t>Toda decisión que amplíe el alcance definido en el Documento del MVP deberá ser evaluada mediante gestión de cambios y aprobada por el Product Owner.</w:t>
       </w:r>
     </w:p>
     <w:p>
@@ -13818,7 +14060,7 @@
           <w:lang w:val="es-419"/>
         </w:rPr>
       </w:pPr>
-      <w:bookmarkStart w:id="23" w:name="_Toc239489861"/>
+      <w:bookmarkStart w:id="23" w:name="_Toc241250922"/>
       <w:r>
         <w:rPr>
           <w:rFonts w:ascii="Verdana" w:hAnsi="Verdana"/>
@@ -14207,7 +14449,7 @@
           <w:lang w:val="es-419"/>
         </w:rPr>
       </w:pPr>
-      <w:bookmarkStart w:id="24" w:name="_Toc239489874"/>
+      <w:bookmarkStart w:id="24" w:name="_Toc241250935"/>
       <w:r>
         <w:rPr>
           <w:rFonts w:ascii="Verdana" w:hAnsi="Verdana"/>
@@ -14312,7 +14554,7 @@
           <w:lang w:val="es-419"/>
         </w:rPr>
       </w:pPr>
-      <w:bookmarkStart w:id="25" w:name="_Toc239489862"/>
+      <w:bookmarkStart w:id="25" w:name="_Toc241250923"/>
       <w:r>
         <w:rPr>
           <w:rFonts w:ascii="Verdana" w:hAnsi="Verdana"/>
@@ -14359,9 +14601,9 @@
       <w:r>
         <w:rPr>
           <w:rFonts w:ascii="Verdana" w:hAnsi="Verdana"/>
-          <w:lang w:val="es-419"/>
-        </w:rPr>
-        <w:t xml:space="preserve">Los entregables académicos hayan sido presentados y revisados. </w:t>
+          <w:lang w:val="es-EC"/>
+        </w:rPr>
+        <w:t>Los entregables académicos hayan sido presentados, versionados y revisados.</w:t>
       </w:r>
     </w:p>
     <w:p>
@@ -14381,9 +14623,10 @@
       <w:r>
         <w:rPr>
           <w:rFonts w:ascii="Verdana" w:hAnsi="Verdana"/>
-          <w:lang w:val="es-419"/>
-        </w:rPr>
-        <w:t xml:space="preserve">La versión desarrollada implemente las funcionalidades priorizadas. </w:t>
+          <w:lang w:val="es-EC"/>
+        </w:rPr>
+        <w:lastRenderedPageBreak/>
+        <w:t>La versión desarrollada implemente las funcionalidades priorizadas y definidas en el Documento del MVP.</w:t>
       </w:r>
     </w:p>
     <w:p>
@@ -14403,9 +14646,9 @@
       <w:r>
         <w:rPr>
           <w:rFonts w:ascii="Verdana" w:hAnsi="Verdana"/>
-          <w:lang w:val="es-419"/>
-        </w:rPr>
-        <w:t xml:space="preserve">Los módulos principales se encuentren integrados. </w:t>
+          <w:lang w:val="es-EC"/>
+        </w:rPr>
+        <w:t>El portal público, registro, acceso, recuperación de contraseña, panel principal y perfil básico se encuentren integrados.</w:t>
       </w:r>
     </w:p>
     <w:p>
@@ -14425,9 +14668,9 @@
       <w:r>
         <w:rPr>
           <w:rFonts w:ascii="Verdana" w:hAnsi="Verdana"/>
-          <w:lang w:val="es-419"/>
-        </w:rPr>
-        <w:t xml:space="preserve">No existan defectos críticos pendientes. </w:t>
+          <w:lang w:val="es-EC"/>
+        </w:rPr>
+        <w:t>Las funcionalidades principales puedan demostrarse de principio a fin sin defectos críticos pendientes.</w:t>
       </w:r>
     </w:p>
     <w:p>
@@ -14447,9 +14690,9 @@
       <w:r>
         <w:rPr>
           <w:rFonts w:ascii="Verdana" w:hAnsi="Verdana"/>
-          <w:lang w:val="es-419"/>
-        </w:rPr>
-        <w:t xml:space="preserve">La solución mantenga controles básicos de seguridad y acceso. </w:t>
+          <w:lang w:val="es-EC"/>
+        </w:rPr>
+        <w:t>La solución mantenga controles básicos de seguridad, sesiones, protección de rutas y almacenamiento seguro de contraseñas.</w:t>
       </w:r>
     </w:p>
     <w:p>
@@ -14469,9 +14712,9 @@
       <w:r>
         <w:rPr>
           <w:rFonts w:ascii="Verdana" w:hAnsi="Verdana"/>
-          <w:lang w:val="es-419"/>
-        </w:rPr>
-        <w:t xml:space="preserve">La aplicación pueda instalarse y demostrarse. </w:t>
+          <w:lang w:val="es-EC"/>
+        </w:rPr>
+        <w:t>La aplicación pueda instalarse, ejecutarse y demostrarse siguiendo las instrucciones del proyecto.</w:t>
       </w:r>
     </w:p>
     <w:p>
@@ -14491,9 +14734,9 @@
       <w:r>
         <w:rPr>
           <w:rFonts w:ascii="Verdana" w:hAnsi="Verdana"/>
-          <w:lang w:val="es-419"/>
-        </w:rPr>
-        <w:t xml:space="preserve">La documentación se encuentre actualizada y trazada. </w:t>
+          <w:lang w:val="es-EC"/>
+        </w:rPr>
+        <w:t>La documentación, las pruebas y las evidencias mantengan trazabilidad con el alcance del MVP.</w:t>
       </w:r>
     </w:p>
     <w:p>
@@ -14513,9 +14756,16 @@
       <w:r>
         <w:rPr>
           <w:rFonts w:ascii="Verdana" w:hAnsi="Verdana"/>
+          <w:lang w:val="es-EC"/>
+        </w:rPr>
+        <w:t>La patrocinadora académica valide el cumplimiento general del Producto Mínimo Viable.</w:t>
+      </w:r>
+      <w:r>
+        <w:rPr>
+          <w:rFonts w:ascii="Verdana" w:hAnsi="Verdana"/>
           <w:lang w:val="es-419"/>
         </w:rPr>
-        <w:t xml:space="preserve">La patrocinadora académica valide el cumplimiento general del proyecto. </w:t>
+        <w:t xml:space="preserve"> </w:t>
       </w:r>
     </w:p>
     <w:p>
@@ -14535,7 +14785,7 @@
           <w:lang w:val="es-419"/>
         </w:rPr>
       </w:pPr>
-      <w:bookmarkStart w:id="26" w:name="_Toc239489863"/>
+      <w:bookmarkStart w:id="26" w:name="_Toc241250924"/>
       <w:r>
         <w:rPr>
           <w:rFonts w:ascii="Verdana" w:hAnsi="Verdana"/>
@@ -14601,7 +14851,7 @@
           <w:lang w:val="es-419"/>
         </w:rPr>
       </w:pPr>
-      <w:bookmarkStart w:id="27" w:name="_Toc239489864"/>
+      <w:bookmarkStart w:id="27" w:name="_Toc241250925"/>
       <w:r>
         <w:rPr>
           <w:rFonts w:ascii="Verdana" w:hAnsi="Verdana"/>
@@ -14629,15 +14879,7 @@
           <w:rFonts w:ascii="Verdana" w:hAnsi="Verdana"/>
           <w:lang w:val="es-419"/>
         </w:rPr>
-        <w:t xml:space="preserve">Toda modificación que afecte el alcance, los entregables o el cronograma deberá ser registrada y evaluada antes de su incorporación. El Product Owner </w:t>
-      </w:r>
-      <w:r>
-        <w:rPr>
-          <w:rFonts w:ascii="Verdana" w:hAnsi="Verdana"/>
-          <w:lang w:val="es-419"/>
-        </w:rPr>
-        <w:lastRenderedPageBreak/>
-        <w:t>analizará su impacto funcional, el equipo técnico determinará el impacto técnico y temporal, y la patrocinadora académica validará los cambios significativos.</w:t>
+        <w:t>Toda modificación que afecte el alcance, los entregables o el cronograma deberá ser registrada y evaluada antes de su incorporación. El Product Owner analizará su impacto funcional, el equipo técnico determinará el impacto técnico y temporal, y la patrocinadora académica validará los cambios significativos.</w:t>
       </w:r>
     </w:p>
     <w:p>
@@ -14657,7 +14899,7 @@
           <w:lang w:val="es-419"/>
         </w:rPr>
       </w:pPr>
-      <w:bookmarkStart w:id="28" w:name="_Toc239489865"/>
+      <w:bookmarkStart w:id="28" w:name="_Toc241250926"/>
       <w:r>
         <w:rPr>
           <w:rFonts w:ascii="Verdana" w:hAnsi="Verdana"/>
@@ -14882,6 +15124,7 @@
                 <w:rFonts w:ascii="Verdana" w:hAnsi="Verdana"/>
                 <w:lang w:val="es-419"/>
               </w:rPr>
+              <w:lastRenderedPageBreak/>
               <w:t>Colaboración documental</w:t>
             </w:r>
           </w:p>
@@ -15662,7 +15905,6 @@
                 <w:rFonts w:ascii="Verdana" w:hAnsi="Verdana"/>
                 <w:lang w:val="es-419"/>
               </w:rPr>
-              <w:lastRenderedPageBreak/>
               <w:t>Pruebas y calidad</w:t>
             </w:r>
           </w:p>
@@ -15730,7 +15972,7 @@
           <w:lang w:val="es-419"/>
         </w:rPr>
       </w:pPr>
-      <w:bookmarkStart w:id="29" w:name="_Toc239489875"/>
+      <w:bookmarkStart w:id="29" w:name="_Toc241250936"/>
       <w:r>
         <w:rPr>
           <w:rFonts w:ascii="Verdana" w:hAnsi="Verdana"/>
@@ -15835,7 +16077,7 @@
           <w:lang w:val="es-419"/>
         </w:rPr>
       </w:pPr>
-      <w:bookmarkStart w:id="30" w:name="_Toc239489866"/>
+      <w:bookmarkStart w:id="30" w:name="_Toc241250927"/>
       <w:r>
         <w:rPr>
           <w:rFonts w:ascii="Verdana" w:hAnsi="Verdana"/>
@@ -15975,7 +16217,15 @@
           <w:rFonts w:ascii="Verdana" w:hAnsi="Verdana"/>
           <w:lang w:val="es-419"/>
         </w:rPr>
-        <w:t>Las reuniones periódicas de seguimiento se realizarán todos los martes, de 21:00 a 22:00, mediante Google Meet. También podrán convocarse reuniones adicionales cuando las necesidades, impedimentos o decisiones del proyecto lo requieran. Los acuerdos, responsables y fechas comprometidas deberán documentarse.</w:t>
+        <w:t xml:space="preserve">Las reuniones periódicas de seguimiento se realizarán todos los martes, de 21:00 a 22:00, mediante Google Meet. También podrán convocarse reuniones adicionales cuando las necesidades, impedimentos o decisiones del </w:t>
+      </w:r>
+      <w:r>
+        <w:rPr>
+          <w:rFonts w:ascii="Verdana" w:hAnsi="Verdana"/>
+          <w:lang w:val="es-419"/>
+        </w:rPr>
+        <w:lastRenderedPageBreak/>
+        <w:t>proyecto lo requieran. Los acuerdos, responsables y fechas comprometidas deberán documentarse.</w:t>
       </w:r>
     </w:p>
     <w:p>
@@ -16878,9 +17128,9 @@
       <w:lvlJc w:val="left"/>
       <w:pPr>
         <w:tabs>
-          <w:tab w:val="num" w:pos="720"/>
+          <w:tab w:val="num" w:pos="363"/>
         </w:tabs>
-        <w:ind w:left="720" w:hanging="360"/>
+        <w:ind w:left="363" w:hanging="360"/>
       </w:pPr>
       <w:rPr>
         <w:rFonts w:ascii="Symbol" w:hAnsi="Symbol" w:hint="default"/>
@@ -16894,9 +17144,9 @@
       <w:lvlJc w:val="left"/>
       <w:pPr>
         <w:tabs>
-          <w:tab w:val="num" w:pos="1440"/>
+          <w:tab w:val="num" w:pos="1083"/>
         </w:tabs>
-        <w:ind w:left="1440" w:hanging="360"/>
+        <w:ind w:left="1083" w:hanging="360"/>
       </w:pPr>
       <w:rPr>
         <w:rFonts w:ascii="Courier New" w:hAnsi="Courier New" w:hint="default"/>
@@ -16910,9 +17160,9 @@
       <w:lvlJc w:val="left"/>
       <w:pPr>
         <w:tabs>
-          <w:tab w:val="num" w:pos="2160"/>
+          <w:tab w:val="num" w:pos="1803"/>
         </w:tabs>
-        <w:ind w:left="2160" w:hanging="360"/>
+        <w:ind w:left="1803" w:hanging="360"/>
       </w:pPr>
       <w:rPr>
         <w:rFonts w:ascii="Wingdings" w:hAnsi="Wingdings" w:hint="default"/>
@@ -16926,9 +17176,9 @@
       <w:lvlJc w:val="left"/>
       <w:pPr>
         <w:tabs>
-          <w:tab w:val="num" w:pos="2880"/>
+          <w:tab w:val="num" w:pos="2523"/>
         </w:tabs>
-        <w:ind w:left="2880" w:hanging="360"/>
+        <w:ind w:left="2523" w:hanging="360"/>
       </w:pPr>
       <w:rPr>
         <w:rFonts w:ascii="Wingdings" w:hAnsi="Wingdings" w:hint="default"/>
@@ -16942,9 +17192,9 @@
       <w:lvlJc w:val="left"/>
       <w:pPr>
         <w:tabs>
-          <w:tab w:val="num" w:pos="3600"/>
+          <w:tab w:val="num" w:pos="3243"/>
         </w:tabs>
-        <w:ind w:left="3600" w:hanging="360"/>
+        <w:ind w:left="3243" w:hanging="360"/>
       </w:pPr>
       <w:rPr>
         <w:rFonts w:ascii="Wingdings" w:hAnsi="Wingdings" w:hint="default"/>
@@ -16958,9 +17208,9 @@
       <w:lvlJc w:val="left"/>
       <w:pPr>
         <w:tabs>
-          <w:tab w:val="num" w:pos="4320"/>
+          <w:tab w:val="num" w:pos="3963"/>
         </w:tabs>
-        <w:ind w:left="4320" w:hanging="360"/>
+        <w:ind w:left="3963" w:hanging="360"/>
       </w:pPr>
       <w:rPr>
         <w:rFonts w:ascii="Wingdings" w:hAnsi="Wingdings" w:hint="default"/>
@@ -16974,9 +17224,9 @@
       <w:lvlJc w:val="left"/>
       <w:pPr>
         <w:tabs>
-          <w:tab w:val="num" w:pos="5040"/>
+          <w:tab w:val="num" w:pos="4683"/>
         </w:tabs>
-        <w:ind w:left="5040" w:hanging="360"/>
+        <w:ind w:left="4683" w:hanging="360"/>
       </w:pPr>
       <w:rPr>
         <w:rFonts w:ascii="Wingdings" w:hAnsi="Wingdings" w:hint="default"/>
@@ -16990,9 +17240,9 @@
       <w:lvlJc w:val="left"/>
       <w:pPr>
         <w:tabs>
-          <w:tab w:val="num" w:pos="5760"/>
+          <w:tab w:val="num" w:pos="5403"/>
         </w:tabs>
-        <w:ind w:left="5760" w:hanging="360"/>
+        <w:ind w:left="5403" w:hanging="360"/>
       </w:pPr>
       <w:rPr>
         <w:rFonts w:ascii="Wingdings" w:hAnsi="Wingdings" w:hint="default"/>
@@ -17006,9 +17256,9 @@
       <w:lvlJc w:val="left"/>
       <w:pPr>
         <w:tabs>
-          <w:tab w:val="num" w:pos="6480"/>
+          <w:tab w:val="num" w:pos="6123"/>
         </w:tabs>
-        <w:ind w:left="6480" w:hanging="360"/>
+        <w:ind w:left="6123" w:hanging="360"/>
       </w:pPr>
       <w:rPr>
         <w:rFonts w:ascii="Wingdings" w:hAnsi="Wingdings" w:hint="default"/>
@@ -17017,6 +17267,95 @@
     </w:lvl>
   </w:abstractNum>
   <w:abstractNum w:abstractNumId="10" w15:restartNumberingAfterBreak="0">
+    <w:nsid w:val="0C0719AA"/>
+    <w:multiLevelType w:val="multilevel"/>
+    <w:tmpl w:val="3D4C07C8"/>
+    <w:lvl w:ilvl="0">
+      <w:start w:val="1"/>
+      <w:numFmt w:val="bullet"/>
+      <w:lvlText w:val=""/>
+      <w:lvlJc w:val="left"/>
+      <w:pPr>
+        <w:ind w:left="360" w:hanging="360"/>
+      </w:pPr>
+      <w:rPr>
+        <w:rFonts w:ascii="Symbol" w:hAnsi="Symbol" w:hint="default"/>
+      </w:rPr>
+    </w:lvl>
+    <w:lvl w:ilvl="1">
+      <w:start w:val="1"/>
+      <w:numFmt w:val="decimal"/>
+      <w:lvlText w:val="%1.%2."/>
+      <w:lvlJc w:val="left"/>
+      <w:pPr>
+        <w:ind w:left="792" w:hanging="432"/>
+      </w:pPr>
+    </w:lvl>
+    <w:lvl w:ilvl="2">
+      <w:start w:val="1"/>
+      <w:numFmt w:val="decimal"/>
+      <w:lvlText w:val="%1.%2.%3."/>
+      <w:lvlJc w:val="left"/>
+      <w:pPr>
+        <w:ind w:left="1224" w:hanging="504"/>
+      </w:pPr>
+    </w:lvl>
+    <w:lvl w:ilvl="3">
+      <w:start w:val="1"/>
+      <w:numFmt w:val="decimal"/>
+      <w:lvlText w:val="%1.%2.%3.%4."/>
+      <w:lvlJc w:val="left"/>
+      <w:pPr>
+        <w:ind w:left="1728" w:hanging="648"/>
+      </w:pPr>
+    </w:lvl>
+    <w:lvl w:ilvl="4">
+      <w:start w:val="1"/>
+      <w:numFmt w:val="decimal"/>
+      <w:lvlText w:val="%1.%2.%3.%4.%5."/>
+      <w:lvlJc w:val="left"/>
+      <w:pPr>
+        <w:ind w:left="2232" w:hanging="792"/>
+      </w:pPr>
+    </w:lvl>
+    <w:lvl w:ilvl="5">
+      <w:start w:val="1"/>
+      <w:numFmt w:val="decimal"/>
+      <w:lvlText w:val="%1.%2.%3.%4.%5.%6."/>
+      <w:lvlJc w:val="left"/>
+      <w:pPr>
+        <w:ind w:left="2736" w:hanging="936"/>
+      </w:pPr>
+    </w:lvl>
+    <w:lvl w:ilvl="6">
+      <w:start w:val="1"/>
+      <w:numFmt w:val="decimal"/>
+      <w:lvlText w:val="%1.%2.%3.%4.%5.%6.%7."/>
+      <w:lvlJc w:val="left"/>
+      <w:pPr>
+        <w:ind w:left="3240" w:hanging="1080"/>
+      </w:pPr>
+    </w:lvl>
+    <w:lvl w:ilvl="7">
+      <w:start w:val="1"/>
+      <w:numFmt w:val="decimal"/>
+      <w:lvlText w:val="%1.%2.%3.%4.%5.%6.%7.%8."/>
+      <w:lvlJc w:val="left"/>
+      <w:pPr>
+        <w:ind w:left="3744" w:hanging="1224"/>
+      </w:pPr>
+    </w:lvl>
+    <w:lvl w:ilvl="8">
+      <w:start w:val="1"/>
+      <w:numFmt w:val="decimal"/>
+      <w:lvlText w:val="%1.%2.%3.%4.%5.%6.%7.%8.%9."/>
+      <w:lvlJc w:val="left"/>
+      <w:pPr>
+        <w:ind w:left="4320" w:hanging="1440"/>
+      </w:pPr>
+    </w:lvl>
+  </w:abstractNum>
+  <w:abstractNum w:abstractNumId="11" w15:restartNumberingAfterBreak="0">
     <w:nsid w:val="0C4725DF"/>
     <w:multiLevelType w:val="hybridMultilevel"/>
     <w:tmpl w:val="1268942A"/>
@@ -17129,7 +17468,7 @@
       </w:rPr>
     </w:lvl>
   </w:abstractNum>
-  <w:abstractNum w:abstractNumId="11" w15:restartNumberingAfterBreak="0">
+  <w:abstractNum w:abstractNumId="12" w15:restartNumberingAfterBreak="0">
     <w:nsid w:val="0EF505A3"/>
     <w:multiLevelType w:val="multilevel"/>
     <w:tmpl w:val="BBBCACF0"/>
@@ -17278,7 +17617,7 @@
       </w:rPr>
     </w:lvl>
   </w:abstractNum>
-  <w:abstractNum w:abstractNumId="12" w15:restartNumberingAfterBreak="0">
+  <w:abstractNum w:abstractNumId="13" w15:restartNumberingAfterBreak="0">
     <w:nsid w:val="12F04288"/>
     <w:multiLevelType w:val="hybridMultilevel"/>
     <w:tmpl w:val="4E6E23D6"/>
@@ -17288,7 +17627,7 @@
       <w:lvlText w:val=""/>
       <w:lvlJc w:val="left"/>
       <w:pPr>
-        <w:ind w:left="360" w:hanging="360"/>
+        <w:ind w:left="1431" w:hanging="360"/>
       </w:pPr>
       <w:rPr>
         <w:rFonts w:ascii="Symbol" w:hAnsi="Symbol" w:hint="default"/>
@@ -17300,7 +17639,7 @@
       <w:lvlText w:val="o"/>
       <w:lvlJc w:val="left"/>
       <w:pPr>
-        <w:ind w:left="1080" w:hanging="360"/>
+        <w:ind w:left="2151" w:hanging="360"/>
       </w:pPr>
       <w:rPr>
         <w:rFonts w:ascii="Courier New" w:hAnsi="Courier New" w:cs="Courier New" w:hint="default"/>
@@ -17312,7 +17651,7 @@
       <w:lvlText w:val=""/>
       <w:lvlJc w:val="left"/>
       <w:pPr>
-        <w:ind w:left="1800" w:hanging="360"/>
+        <w:ind w:left="2871" w:hanging="360"/>
       </w:pPr>
       <w:rPr>
         <w:rFonts w:ascii="Wingdings" w:hAnsi="Wingdings" w:hint="default"/>
@@ -17324,7 +17663,7 @@
       <w:lvlText w:val=""/>
       <w:lvlJc w:val="left"/>
       <w:pPr>
-        <w:ind w:left="2520" w:hanging="360"/>
+        <w:ind w:left="3591" w:hanging="360"/>
       </w:pPr>
       <w:rPr>
         <w:rFonts w:ascii="Symbol" w:hAnsi="Symbol" w:hint="default"/>
@@ -17336,7 +17675,7 @@
       <w:lvlText w:val="o"/>
       <w:lvlJc w:val="left"/>
       <w:pPr>
-        <w:ind w:left="3240" w:hanging="360"/>
+        <w:ind w:left="4311" w:hanging="360"/>
       </w:pPr>
       <w:rPr>
         <w:rFonts w:ascii="Courier New" w:hAnsi="Courier New" w:cs="Courier New" w:hint="default"/>
@@ -17348,7 +17687,7 @@
       <w:lvlText w:val=""/>
       <w:lvlJc w:val="left"/>
       <w:pPr>
-        <w:ind w:left="3960" w:hanging="360"/>
+        <w:ind w:left="5031" w:hanging="360"/>
       </w:pPr>
       <w:rPr>
         <w:rFonts w:ascii="Wingdings" w:hAnsi="Wingdings" w:hint="default"/>
@@ -17360,7 +17699,7 @@
       <w:lvlText w:val=""/>
       <w:lvlJc w:val="left"/>
       <w:pPr>
-        <w:ind w:left="4680" w:hanging="360"/>
+        <w:ind w:left="5751" w:hanging="360"/>
       </w:pPr>
       <w:rPr>
         <w:rFonts w:ascii="Symbol" w:hAnsi="Symbol" w:hint="default"/>
@@ -17372,7 +17711,7 @@
       <w:lvlText w:val="o"/>
       <w:lvlJc w:val="left"/>
       <w:pPr>
-        <w:ind w:left="5400" w:hanging="360"/>
+        <w:ind w:left="6471" w:hanging="360"/>
       </w:pPr>
       <w:rPr>
         <w:rFonts w:ascii="Courier New" w:hAnsi="Courier New" w:cs="Courier New" w:hint="default"/>
@@ -17384,14 +17723,14 @@
       <w:lvlText w:val=""/>
       <w:lvlJc w:val="left"/>
       <w:pPr>
-        <w:ind w:left="6120" w:hanging="360"/>
+        <w:ind w:left="7191" w:hanging="360"/>
       </w:pPr>
       <w:rPr>
         <w:rFonts w:ascii="Wingdings" w:hAnsi="Wingdings" w:hint="default"/>
       </w:rPr>
     </w:lvl>
   </w:abstractNum>
-  <w:abstractNum w:abstractNumId="13" w15:restartNumberingAfterBreak="0">
+  <w:abstractNum w:abstractNumId="14" w15:restartNumberingAfterBreak="0">
     <w:nsid w:val="1A84787A"/>
     <w:multiLevelType w:val="multilevel"/>
     <w:tmpl w:val="72FA4514"/>
@@ -17507,7 +17846,7 @@
       </w:pPr>
     </w:lvl>
   </w:abstractNum>
-  <w:abstractNum w:abstractNumId="14" w15:restartNumberingAfterBreak="0">
+  <w:abstractNum w:abstractNumId="15" w15:restartNumberingAfterBreak="0">
     <w:nsid w:val="1C121C0D"/>
     <w:multiLevelType w:val="multilevel"/>
     <w:tmpl w:val="72FA4514"/>
@@ -17623,7 +17962,7 @@
       </w:pPr>
     </w:lvl>
   </w:abstractNum>
-  <w:abstractNum w:abstractNumId="15" w15:restartNumberingAfterBreak="0">
+  <w:abstractNum w:abstractNumId="16" w15:restartNumberingAfterBreak="0">
     <w:nsid w:val="1CAB7C61"/>
     <w:multiLevelType w:val="multilevel"/>
     <w:tmpl w:val="72FA4514"/>
@@ -17739,7 +18078,7 @@
       </w:pPr>
     </w:lvl>
   </w:abstractNum>
-  <w:abstractNum w:abstractNumId="16" w15:restartNumberingAfterBreak="0">
+  <w:abstractNum w:abstractNumId="17" w15:restartNumberingAfterBreak="0">
     <w:nsid w:val="1F0F4BF7"/>
     <w:multiLevelType w:val="multilevel"/>
     <w:tmpl w:val="1354041C"/>
@@ -17888,7 +18227,7 @@
       </w:rPr>
     </w:lvl>
   </w:abstractNum>
-  <w:abstractNum w:abstractNumId="17" w15:restartNumberingAfterBreak="0">
+  <w:abstractNum w:abstractNumId="18" w15:restartNumberingAfterBreak="0">
     <w:nsid w:val="1F622969"/>
     <w:multiLevelType w:val="multilevel"/>
     <w:tmpl w:val="0409001F"/>
@@ -17974,7 +18313,7 @@
       </w:pPr>
     </w:lvl>
   </w:abstractNum>
-  <w:abstractNum w:abstractNumId="18" w15:restartNumberingAfterBreak="0">
+  <w:abstractNum w:abstractNumId="19" w15:restartNumberingAfterBreak="0">
     <w:nsid w:val="28BA3029"/>
     <w:multiLevelType w:val="multilevel"/>
     <w:tmpl w:val="B930023C"/>
@@ -18123,7 +18462,7 @@
       </w:rPr>
     </w:lvl>
   </w:abstractNum>
-  <w:abstractNum w:abstractNumId="19" w15:restartNumberingAfterBreak="0">
+  <w:abstractNum w:abstractNumId="20" w15:restartNumberingAfterBreak="0">
     <w:nsid w:val="29DE6E6C"/>
     <w:multiLevelType w:val="multilevel"/>
     <w:tmpl w:val="0409001F"/>
@@ -18209,7 +18548,7 @@
       </w:pPr>
     </w:lvl>
   </w:abstractNum>
-  <w:abstractNum w:abstractNumId="20" w15:restartNumberingAfterBreak="0">
+  <w:abstractNum w:abstractNumId="21" w15:restartNumberingAfterBreak="0">
     <w:nsid w:val="31F94FAC"/>
     <w:multiLevelType w:val="multilevel"/>
     <w:tmpl w:val="72FA4514"/>
@@ -18325,7 +18664,7 @@
       </w:pPr>
     </w:lvl>
   </w:abstractNum>
-  <w:abstractNum w:abstractNumId="21" w15:restartNumberingAfterBreak="0">
+  <w:abstractNum w:abstractNumId="22" w15:restartNumberingAfterBreak="0">
     <w:nsid w:val="33520F1D"/>
     <w:multiLevelType w:val="multilevel"/>
     <w:tmpl w:val="0409001F"/>
@@ -18411,7 +18750,7 @@
       </w:pPr>
     </w:lvl>
   </w:abstractNum>
-  <w:abstractNum w:abstractNumId="22" w15:restartNumberingAfterBreak="0">
+  <w:abstractNum w:abstractNumId="23" w15:restartNumberingAfterBreak="0">
     <w:nsid w:val="34D62A9A"/>
     <w:multiLevelType w:val="multilevel"/>
     <w:tmpl w:val="2EBAFA82"/>
@@ -18560,7 +18899,7 @@
       </w:rPr>
     </w:lvl>
   </w:abstractNum>
-  <w:abstractNum w:abstractNumId="23" w15:restartNumberingAfterBreak="0">
+  <w:abstractNum w:abstractNumId="24" w15:restartNumberingAfterBreak="0">
     <w:nsid w:val="363F4F5D"/>
     <w:multiLevelType w:val="multilevel"/>
     <w:tmpl w:val="72FA4514"/>
@@ -18676,7 +19015,7 @@
       </w:pPr>
     </w:lvl>
   </w:abstractNum>
-  <w:abstractNum w:abstractNumId="24" w15:restartNumberingAfterBreak="0">
+  <w:abstractNum w:abstractNumId="25" w15:restartNumberingAfterBreak="0">
     <w:nsid w:val="3C7102F0"/>
     <w:multiLevelType w:val="multilevel"/>
     <w:tmpl w:val="E4760042"/>
@@ -18825,7 +19164,7 @@
       </w:rPr>
     </w:lvl>
   </w:abstractNum>
-  <w:abstractNum w:abstractNumId="25" w15:restartNumberingAfterBreak="0">
+  <w:abstractNum w:abstractNumId="26" w15:restartNumberingAfterBreak="0">
     <w:nsid w:val="3C7D3D3E"/>
     <w:multiLevelType w:val="multilevel"/>
     <w:tmpl w:val="848C7A56"/>
@@ -18974,7 +19313,7 @@
       </w:rPr>
     </w:lvl>
   </w:abstractNum>
-  <w:abstractNum w:abstractNumId="26" w15:restartNumberingAfterBreak="0">
+  <w:abstractNum w:abstractNumId="27" w15:restartNumberingAfterBreak="0">
     <w:nsid w:val="40390FEA"/>
     <w:multiLevelType w:val="multilevel"/>
     <w:tmpl w:val="72FA4514"/>
@@ -19090,7 +19429,7 @@
       </w:pPr>
     </w:lvl>
   </w:abstractNum>
-  <w:abstractNum w:abstractNumId="27" w15:restartNumberingAfterBreak="0">
+  <w:abstractNum w:abstractNumId="28" w15:restartNumberingAfterBreak="0">
     <w:nsid w:val="44937D68"/>
     <w:multiLevelType w:val="hybridMultilevel"/>
     <w:tmpl w:val="A692A0CC"/>
@@ -19203,7 +19542,7 @@
       </w:rPr>
     </w:lvl>
   </w:abstractNum>
-  <w:abstractNum w:abstractNumId="28" w15:restartNumberingAfterBreak="0">
+  <w:abstractNum w:abstractNumId="29" w15:restartNumberingAfterBreak="0">
     <w:nsid w:val="455E7671"/>
     <w:multiLevelType w:val="multilevel"/>
     <w:tmpl w:val="61C67F0E"/>
@@ -19352,7 +19691,7 @@
       </w:rPr>
     </w:lvl>
   </w:abstractNum>
-  <w:abstractNum w:abstractNumId="29" w15:restartNumberingAfterBreak="0">
+  <w:abstractNum w:abstractNumId="30" w15:restartNumberingAfterBreak="0">
     <w:nsid w:val="46B54587"/>
     <w:multiLevelType w:val="hybridMultilevel"/>
     <w:tmpl w:val="2324A546"/>
@@ -19465,7 +19804,7 @@
       </w:rPr>
     </w:lvl>
   </w:abstractNum>
-  <w:abstractNum w:abstractNumId="30" w15:restartNumberingAfterBreak="0">
+  <w:abstractNum w:abstractNumId="31" w15:restartNumberingAfterBreak="0">
     <w:nsid w:val="588A7FDB"/>
     <w:multiLevelType w:val="multilevel"/>
     <w:tmpl w:val="7A72F8F0"/>
@@ -19614,7 +19953,7 @@
       </w:rPr>
     </w:lvl>
   </w:abstractNum>
-  <w:abstractNum w:abstractNumId="31" w15:restartNumberingAfterBreak="0">
+  <w:abstractNum w:abstractNumId="32" w15:restartNumberingAfterBreak="0">
     <w:nsid w:val="68FF5DB5"/>
     <w:multiLevelType w:val="multilevel"/>
     <w:tmpl w:val="72FA4514"/>
@@ -19730,7 +20069,7 @@
       </w:pPr>
     </w:lvl>
   </w:abstractNum>
-  <w:abstractNum w:abstractNumId="32" w15:restartNumberingAfterBreak="0">
+  <w:abstractNum w:abstractNumId="33" w15:restartNumberingAfterBreak="0">
     <w:nsid w:val="72E475F2"/>
     <w:multiLevelType w:val="hybridMultilevel"/>
     <w:tmpl w:val="4E2C5C7E"/>
@@ -19843,7 +20182,7 @@
       </w:rPr>
     </w:lvl>
   </w:abstractNum>
-  <w:abstractNum w:abstractNumId="33" w15:restartNumberingAfterBreak="0">
+  <w:abstractNum w:abstractNumId="34" w15:restartNumberingAfterBreak="0">
     <w:nsid w:val="77DF0696"/>
     <w:multiLevelType w:val="multilevel"/>
     <w:tmpl w:val="0409001F"/>
@@ -19929,7 +20268,7 @@
       </w:pPr>
     </w:lvl>
   </w:abstractNum>
-  <w:abstractNum w:abstractNumId="34" w15:restartNumberingAfterBreak="0">
+  <w:abstractNum w:abstractNumId="35" w15:restartNumberingAfterBreak="0">
     <w:nsid w:val="78396827"/>
     <w:multiLevelType w:val="multilevel"/>
     <w:tmpl w:val="CAAA8442"/>
@@ -20078,7 +20417,7 @@
       </w:rPr>
     </w:lvl>
   </w:abstractNum>
-  <w:abstractNum w:abstractNumId="35" w15:restartNumberingAfterBreak="0">
+  <w:abstractNum w:abstractNumId="36" w15:restartNumberingAfterBreak="0">
     <w:nsid w:val="7B1D53E4"/>
     <w:multiLevelType w:val="multilevel"/>
     <w:tmpl w:val="0409001F"/>
@@ -20183,94 +20522,97 @@
     <w:abstractNumId w:val="0"/>
   </w:num>
   <w:num w:numId="7" w16cid:durableId="2108575963">
+    <w:abstractNumId w:val="18"/>
+  </w:num>
+  <w:num w:numId="8" w16cid:durableId="1989818918">
     <w:abstractNumId w:val="17"/>
   </w:num>
-  <w:num w:numId="8" w16cid:durableId="1989818918">
-    <w:abstractNumId w:val="16"/>
-  </w:num>
   <w:num w:numId="9" w16cid:durableId="742798510">
-    <w:abstractNumId w:val="29"/>
+    <w:abstractNumId w:val="30"/>
   </w:num>
   <w:num w:numId="10" w16cid:durableId="493841407">
-    <w:abstractNumId w:val="34"/>
+    <w:abstractNumId w:val="35"/>
   </w:num>
   <w:num w:numId="11" w16cid:durableId="1375690916">
-    <w:abstractNumId w:val="30"/>
+    <w:abstractNumId w:val="31"/>
   </w:num>
   <w:num w:numId="12" w16cid:durableId="1556353896">
-    <w:abstractNumId w:val="25"/>
+    <w:abstractNumId w:val="26"/>
   </w:num>
   <w:num w:numId="13" w16cid:durableId="658194286">
     <w:abstractNumId w:val="9"/>
   </w:num>
   <w:num w:numId="14" w16cid:durableId="1874461593">
-    <w:abstractNumId w:val="11"/>
+    <w:abstractNumId w:val="12"/>
   </w:num>
   <w:num w:numId="15" w16cid:durableId="1911698123">
-    <w:abstractNumId w:val="28"/>
+    <w:abstractNumId w:val="29"/>
   </w:num>
   <w:num w:numId="16" w16cid:durableId="607275060">
+    <w:abstractNumId w:val="25"/>
+  </w:num>
+  <w:num w:numId="17" w16cid:durableId="297801582">
+    <w:abstractNumId w:val="19"/>
+  </w:num>
+  <w:num w:numId="18" w16cid:durableId="1959600520">
+    <w:abstractNumId w:val="23"/>
+  </w:num>
+  <w:num w:numId="19" w16cid:durableId="276061179">
+    <w:abstractNumId w:val="36"/>
+  </w:num>
+  <w:num w:numId="20" w16cid:durableId="1482961643">
+    <w:abstractNumId w:val="20"/>
+  </w:num>
+  <w:num w:numId="21" w16cid:durableId="1810779192">
+    <w:abstractNumId w:val="22"/>
+  </w:num>
+  <w:num w:numId="22" w16cid:durableId="876770604">
+    <w:abstractNumId w:val="34"/>
+  </w:num>
+  <w:num w:numId="23" w16cid:durableId="1700157880">
+    <w:abstractNumId w:val="14"/>
+  </w:num>
+  <w:num w:numId="24" w16cid:durableId="1507744258">
     <w:abstractNumId w:val="24"/>
   </w:num>
-  <w:num w:numId="17" w16cid:durableId="297801582">
-    <w:abstractNumId w:val="18"/>
+  <w:num w:numId="25" w16cid:durableId="1631862629">
+    <w:abstractNumId w:val="27"/>
   </w:num>
-  <w:num w:numId="18" w16cid:durableId="1959600520">
-    <w:abstractNumId w:val="22"/>
+  <w:num w:numId="26" w16cid:durableId="658003944">
+    <w:abstractNumId w:val="15"/>
   </w:num>
-  <w:num w:numId="19" w16cid:durableId="276061179">
-    <w:abstractNumId w:val="35"/>
+  <w:num w:numId="27" w16cid:durableId="301353639">
+    <w:abstractNumId w:val="16"/>
   </w:num>
-  <w:num w:numId="20" w16cid:durableId="1482961643">
-    <w:abstractNumId w:val="19"/>
-  </w:num>
-  <w:num w:numId="21" w16cid:durableId="1810779192">
+  <w:num w:numId="28" w16cid:durableId="583534015">
     <w:abstractNumId w:val="21"/>
   </w:num>
-  <w:num w:numId="22" w16cid:durableId="876770604">
-    <w:abstractNumId w:val="33"/>
-  </w:num>
-  <w:num w:numId="23" w16cid:durableId="1700157880">
-    <w:abstractNumId w:val="13"/>
-  </w:num>
-  <w:num w:numId="24" w16cid:durableId="1507744258">
-    <w:abstractNumId w:val="23"/>
-  </w:num>
-  <w:num w:numId="25" w16cid:durableId="1631862629">
-    <w:abstractNumId w:val="26"/>
-  </w:num>
-  <w:num w:numId="26" w16cid:durableId="658003944">
-    <w:abstractNumId w:val="14"/>
-  </w:num>
-  <w:num w:numId="27" w16cid:durableId="301353639">
-    <w:abstractNumId w:val="15"/>
-  </w:num>
-  <w:num w:numId="28" w16cid:durableId="583534015">
-    <w:abstractNumId w:val="20"/>
-  </w:num>
   <w:num w:numId="29" w16cid:durableId="1421608952">
-    <w:abstractNumId w:val="31"/>
+    <w:abstractNumId w:val="32"/>
   </w:num>
   <w:num w:numId="30" w16cid:durableId="604315546">
     <w:abstractNumId w:val="8"/>
   </w:num>
   <w:num w:numId="31" w16cid:durableId="1464041237">
-    <w:abstractNumId w:val="10"/>
+    <w:abstractNumId w:val="11"/>
   </w:num>
   <w:num w:numId="32" w16cid:durableId="1897547089">
     <w:abstractNumId w:val="7"/>
   </w:num>
   <w:num w:numId="33" w16cid:durableId="1704163849">
-    <w:abstractNumId w:val="32"/>
+    <w:abstractNumId w:val="33"/>
   </w:num>
   <w:num w:numId="34" w16cid:durableId="2015642826">
     <w:abstractNumId w:val="6"/>
   </w:num>
   <w:num w:numId="35" w16cid:durableId="1029573262">
-    <w:abstractNumId w:val="12"/>
+    <w:abstractNumId w:val="13"/>
   </w:num>
   <w:num w:numId="36" w16cid:durableId="544953160">
-    <w:abstractNumId w:val="27"/>
+    <w:abstractNumId w:val="28"/>
+  </w:num>
+  <w:num w:numId="37" w16cid:durableId="1334647810">
+    <w:abstractNumId w:val="10"/>
   </w:num>
   <w:numIdMacAtCleanup w:val="12"/>
 </w:numbering>

</xml_diff>